<commit_message>
Update Dizzy_Carotid_Duplex.docx from Colab
</commit_message>
<xml_diff>
--- a/Patient education/Dizzy_Carotid_Duplex.docx
+++ b/Patient education/Dizzy_Carotid_Duplex.docx
@@ -1031,23 +1031,7 @@
         </w:r>
       </w:hyperlink>
       <w:r>
-        <w:t>. Brott TG, Halperin JL, Abbara S, et al. Journal of the American College of Cardiology. 2011;57(8</w:t>
-      </w:r>
-      <w:proofErr w:type="gramStart"/>
-      <w:r>
-        <w:t>):e</w:t>
-      </w:r>
-      <w:proofErr w:type="gramEnd"/>
-      <w:r>
-        <w:t xml:space="preserve">16-94. </w:t>
-      </w:r>
-      <w:proofErr w:type="gramStart"/>
-      <w:r>
-        <w:t>doi:10.1016/j.jacc</w:t>
-      </w:r>
-      <w:proofErr w:type="gramEnd"/>
-      <w:r>
-        <w:t>.2010.11.006.</w:t>
+        <w:t>. Brott TG, Halperin JL, Abbara S, et al. Journal of the American College of Cardiology. 2011;57(8):e16-94. doi:10.1016/j.jacc.2010.11.006.</w:t>
       </w:r>
     </w:p>
     <w:p>
@@ -1073,23 +1057,7 @@
         </w:r>
       </w:hyperlink>
       <w:r>
-        <w:t>. Brott TG, Halperin JL, Abbara S, et al. Journal of the American College of Cardiology. 2011;57(8</w:t>
-      </w:r>
-      <w:proofErr w:type="gramStart"/>
-      <w:r>
-        <w:t>):e</w:t>
-      </w:r>
-      <w:proofErr w:type="gramEnd"/>
-      <w:r>
-        <w:t xml:space="preserve">16-94. </w:t>
-      </w:r>
-      <w:proofErr w:type="gramStart"/>
-      <w:r>
-        <w:t>doi:10.1016/j.jacc</w:t>
-      </w:r>
-      <w:proofErr w:type="gramEnd"/>
-      <w:r>
-        <w:t>.2010.11.006.</w:t>
+        <w:t>. Brott TG, Halperin JL, Abbara S, et al. Journal of the American College of Cardiology. 2011;57(8):e16-94. doi:10.1016/j.jacc.2010.11.006.</w:t>
       </w:r>
     </w:p>
     <w:p>
@@ -1116,13 +1084,8 @@
       </w:r>
       <w:proofErr w:type="spellEnd"/>
       <w:r>
-        <w:t xml:space="preserve"> V, Weisberg MK. Journal of the American Geriatrics Society. 1981;29(9):402-6. doi:10.1111/j.1532-</w:t>
-      </w:r>
-      <w:proofErr w:type="gramStart"/>
-      <w:r>
-        <w:t>5415.1981.tb02378.x.</w:t>
-      </w:r>
-      <w:proofErr w:type="gramEnd"/>
+        <w:t xml:space="preserve"> V, Weisberg MK. Journal of the American Geriatrics Society. 1981;29(9):402-6. doi:10.1111/j.1532-5415.1981.tb02378.x.</w:t>
+      </w:r>
     </w:p>
     <w:p>
       <w:pPr>
@@ -1372,6 +1335,9 @@
         <w:br/>
       </w:r>
       <w:r>
+        <w:rPr>
+          <w:noProof/>
+        </w:rPr>
         <w:lastRenderedPageBreak/>
         <w:drawing>
           <wp:inline distT="0" distB="0" distL="0" distR="0" wp14:anchorId="373E9EC4" wp14:editId="48A329CF">
@@ -1839,13 +1805,8 @@
             <w:hideMark/>
           </w:tcPr>
           <w:p>
-            <w:proofErr w:type="gramStart"/>
             <w:r>
-              <w:t>Usually</w:t>
-            </w:r>
-            <w:proofErr w:type="gramEnd"/>
-            <w:r>
-              <w:t xml:space="preserve"> 30 minutes</w:t>
+              <w:t>Usually 30 minutes</w:t>
             </w:r>
           </w:p>
         </w:tc>
@@ -2477,15 +2438,7 @@
         </w:r>
       </w:hyperlink>
       <w:r>
-        <w:t xml:space="preserve">. Kerber KA, Carender W, Meurer WJ. JAMA. </w:t>
-      </w:r>
-      <w:proofErr w:type="gramStart"/>
-      <w:r>
-        <w:t>2026;:</w:t>
-      </w:r>
-      <w:proofErr w:type="gramEnd"/>
-      <w:r>
-        <w:t>2848127. doi:10.1001/jama.2026.1927.</w:t>
+        <w:t>. Kerber KA, Carender W, Meurer WJ. JAMA. 2026;:2848127. doi:10.1001/jama.2026.1927.</w:t>
       </w:r>
     </w:p>
     <w:p>
@@ -2542,15 +2495,7 @@
         </w:r>
       </w:hyperlink>
       <w:r>
-        <w:t xml:space="preserve">. Moloney D, Youssef A, Okamoto LE. JAMA Internal Medicine. </w:t>
-      </w:r>
-      <w:proofErr w:type="gramStart"/>
-      <w:r>
-        <w:t>2026;:</w:t>
-      </w:r>
-      <w:proofErr w:type="gramEnd"/>
-      <w:r>
-        <w:t>2847532. doi:10.1001/jamainternmed.2026.0284.</w:t>
+        <w:t>. Moloney D, Youssef A, Okamoto LE. JAMA Internal Medicine. 2026;:2847532. doi:10.1001/jamainternmed.2026.0284.</w:t>
       </w:r>
     </w:p>
     <w:p>
@@ -2615,15 +2560,7 @@
       </w:r>
       <w:proofErr w:type="spellEnd"/>
       <w:r>
-        <w:t xml:space="preserve"> AF, Avgerinos ED, Chang RW, et al. Journal of Vascular Surgery. 2022;75(1S):26S-98S. </w:t>
-      </w:r>
-      <w:proofErr w:type="gramStart"/>
-      <w:r>
-        <w:t>doi:10.1016/j.jvs</w:t>
-      </w:r>
-      <w:proofErr w:type="gramEnd"/>
-      <w:r>
-        <w:t>.2021.04.074.</w:t>
+        <w:t xml:space="preserve"> AF, Avgerinos ED, Chang RW, et al. Journal of Vascular Surgery. 2022;75(1S):26S-98S. doi:10.1016/j.jvs.2021.04.074.</w:t>
       </w:r>
     </w:p>
     <w:p>
@@ -2696,31 +2633,7 @@
       </w:r>
       <w:proofErr w:type="spellEnd"/>
       <w:r>
-        <w:t xml:space="preserve"> L, et al. Otolaryngology--Head and Neck </w:t>
-      </w:r>
-      <w:proofErr w:type="gramStart"/>
-      <w:r>
-        <w:t>Surgery :</w:t>
-      </w:r>
-      <w:proofErr w:type="gramEnd"/>
-      <w:r>
-        <w:t xml:space="preserve"> Official Journal of American Academy of Otolaryngology-Head and Neck Surgery. 2008;139(5 Suppl 4</w:t>
-      </w:r>
-      <w:proofErr w:type="gramStart"/>
-      <w:r>
-        <w:t>):S</w:t>
-      </w:r>
-      <w:proofErr w:type="gramEnd"/>
-      <w:r>
-        <w:t xml:space="preserve">47-81. </w:t>
-      </w:r>
-      <w:proofErr w:type="gramStart"/>
-      <w:r>
-        <w:t>doi:10.1016/j.otohns</w:t>
-      </w:r>
-      <w:proofErr w:type="gramEnd"/>
-      <w:r>
-        <w:t>.2008.08.022.</w:t>
+        <w:t xml:space="preserve"> L, et al. Otolaryngology--Head and Neck Surgery : Official Journal of American Academy of Otolaryngology-Head and Neck Surgery. 2008;139(5 Suppl 4):S47-81. doi:10.1016/j.otohns.2008.08.022.</w:t>
       </w:r>
     </w:p>
     <w:p>
@@ -2747,15 +2660,7 @@
       </w:r>
       <w:proofErr w:type="spellEnd"/>
       <w:r>
-        <w:t xml:space="preserve"> AR, Gibbons C, et al. Journal of the American College of Cardiology. 2018;72(11):1294-1309. </w:t>
-      </w:r>
-      <w:proofErr w:type="gramStart"/>
-      <w:r>
-        <w:t>doi:10.1016/j.jacc</w:t>
-      </w:r>
-      <w:proofErr w:type="gramEnd"/>
-      <w:r>
-        <w:t>.2018.05.079.</w:t>
+        <w:t xml:space="preserve"> AR, Gibbons C, et al. Journal of the American College of Cardiology. 2018;72(11):1294-1309. doi:10.1016/j.jacc.2018.05.079.</w:t>
       </w:r>
     </w:p>
     <w:p>
@@ -2778,23 +2683,7 @@
       </w:r>
       <w:r>
         <w:lastRenderedPageBreak/>
-        <w:t>Journal of the American College of Cardiology. 2011;57(8</w:t>
-      </w:r>
-      <w:proofErr w:type="gramStart"/>
-      <w:r>
-        <w:t>):e</w:t>
-      </w:r>
-      <w:proofErr w:type="gramEnd"/>
-      <w:r>
-        <w:t xml:space="preserve">16-94. </w:t>
-      </w:r>
-      <w:proofErr w:type="gramStart"/>
-      <w:r>
-        <w:t>doi:10.1016/j.jacc</w:t>
-      </w:r>
-      <w:proofErr w:type="gramEnd"/>
-      <w:r>
-        <w:t>.2010.11.006.</w:t>
+        <w:t>Journal of the American College of Cardiology. 2011;57(8):e16-94. doi:10.1016/j.jacc.2010.11.006.</w:t>
       </w:r>
     </w:p>
     <w:p>
@@ -2813,31 +2702,7 @@
         </w:r>
       </w:hyperlink>
       <w:r>
-        <w:t xml:space="preserve">. Wang LL, Thompson TA, Shih RY, et al. Journal of the American College of </w:t>
-      </w:r>
-      <w:proofErr w:type="gramStart"/>
-      <w:r>
-        <w:t>Radiology :</w:t>
-      </w:r>
-      <w:proofErr w:type="gramEnd"/>
-      <w:r>
-        <w:t xml:space="preserve"> JACR. 2024;21(6S</w:t>
-      </w:r>
-      <w:proofErr w:type="gramStart"/>
-      <w:r>
-        <w:t>):S</w:t>
-      </w:r>
-      <w:proofErr w:type="gramEnd"/>
-      <w:r>
-        <w:t xml:space="preserve">100-S125. </w:t>
-      </w:r>
-      <w:proofErr w:type="gramStart"/>
-      <w:r>
-        <w:t>doi:10.1016/j.jacr</w:t>
-      </w:r>
-      <w:proofErr w:type="gramEnd"/>
-      <w:r>
-        <w:t>.2024.02.018.</w:t>
+        <w:t>. Wang LL, Thompson TA, Shih RY, et al. Journal of the American College of Radiology : JACR. 2024;21(6S):S100-S125. doi:10.1016/j.jacr.2024.02.018.</w:t>
       </w:r>
     </w:p>
     <w:p>
@@ -2856,18 +2721,3591 @@
         </w:r>
       </w:hyperlink>
       <w:r>
-        <w:t xml:space="preserve">. Sturzenegger M, Newell DW, Douville C, Byrd S, Schoonover K. Stroke. 1994;25(9):1776-83. </w:t>
-      </w:r>
-      <w:proofErr w:type="gramStart"/>
-      <w:r>
-        <w:t>doi:10.1161/01.str</w:t>
-      </w:r>
-      <w:proofErr w:type="gramEnd"/>
-      <w:r>
-        <w:t>.25.9.1776.</w:t>
+        <w:t>. Sturzenegger M, Newell DW, Douville C, Byrd S, Schoonover K. Stroke. 1994;25(9):1776-83. doi:10.1161/01.str.25.9.1776.</w:t>
       </w:r>
     </w:p>
     <w:p/>
+    <w:p/>
+    <w:p>
+      <w:r>
+        <w:rPr>
+          <w:b/>
+          <w:bCs/>
+        </w:rPr>
+        <w:t>Persistent postural-perceptual dizziness (PPPD)</w:t>
+      </w:r>
+      <w:r>
+        <w:t xml:space="preserve"> is a </w:t>
+      </w:r>
+      <w:r>
+        <w:rPr>
+          <w:b/>
+          <w:bCs/>
+        </w:rPr>
+        <w:t>chronic functional vestibular disorder</w:t>
+      </w:r>
+      <w:r>
+        <w:t xml:space="preserve"> characterized by </w:t>
+      </w:r>
+      <w:r>
+        <w:rPr>
+          <w:b/>
+          <w:bCs/>
+        </w:rPr>
+        <w:t>dizziness, unsteadiness, or non-spinning vertigo lasting ≥3 months</w:t>
+      </w:r>
+      <w:r>
+        <w:t>, exacerbated by upright posture, motion, and complex visual stimuli.</w:t>
+      </w:r>
+      <w:hyperlink r:id="rId92" w:history="1">
+        <w:r>
+          <w:rPr>
+            <w:rStyle w:val="ae"/>
+          </w:rPr>
+          <w:t>[1]</w:t>
+        </w:r>
+      </w:hyperlink>
+      <w:hyperlink r:id="rId93" w:history="1">
+        <w:r>
+          <w:rPr>
+            <w:rStyle w:val="ae"/>
+          </w:rPr>
+          <w:t>[2]</w:t>
+        </w:r>
+      </w:hyperlink>
+      <w:hyperlink r:id="rId94" w:history="1">
+        <w:r>
+          <w:rPr>
+            <w:rStyle w:val="ae"/>
+          </w:rPr>
+          <w:t>[3]</w:t>
+        </w:r>
+      </w:hyperlink>
+      <w:r>
+        <w:t xml:space="preserve"> It is the most common cause of chronic vestibular symptoms, affecting approximately 20% of patients with vestibular symptoms in general neurology clinics and up to 40% in specialized dizziness centers.</w:t>
+      </w:r>
+      <w:hyperlink r:id="rId95" w:history="1">
+        <w:r>
+          <w:rPr>
+            <w:rStyle w:val="ae"/>
+          </w:rPr>
+          <w:t>[3]</w:t>
+        </w:r>
+      </w:hyperlink>
+      <w:r>
+        <w:br/>
+      </w:r>
+      <w:r>
+        <w:br/>
+      </w:r>
+      <w:r>
+        <w:rPr>
+          <w:b/>
+          <w:bCs/>
+        </w:rPr>
+        <w:t>Diagnostic Criteria (Bárány Society, 2017)</w:t>
+      </w:r>
+      <w:r>
+        <w:br/>
+      </w:r>
+      <w:r>
+        <w:br/>
+        <w:t>All five criteria must be met:</w:t>
+      </w:r>
+      <w:hyperlink r:id="rId96" w:history="1">
+        <w:r>
+          <w:rPr>
+            <w:rStyle w:val="ae"/>
+          </w:rPr>
+          <w:t>[3]</w:t>
+        </w:r>
+      </w:hyperlink>
+      <w:hyperlink r:id="rId97" w:history="1">
+        <w:r>
+          <w:rPr>
+            <w:rStyle w:val="ae"/>
+          </w:rPr>
+          <w:t>[1]</w:t>
+        </w:r>
+      </w:hyperlink>
+      <w:r>
+        <w:br/>
+      </w:r>
+      <w:r>
+        <w:br/>
+        <w:t xml:space="preserve">1. </w:t>
+      </w:r>
+      <w:r>
+        <w:rPr>
+          <w:b/>
+          <w:bCs/>
+        </w:rPr>
+        <w:t>Dizziness, unsteadiness, or non-spinning vertigo</w:t>
+      </w:r>
+      <w:r>
+        <w:t xml:space="preserve"> present on most days for ≥3 months (symptoms wax and wane, may worsen as day progresses)</w:t>
+      </w:r>
+      <w:r>
+        <w:br/>
+      </w:r>
+      <w:r>
+        <w:br/>
+        <w:t xml:space="preserve">2. </w:t>
+      </w:r>
+      <w:r>
+        <w:rPr>
+          <w:b/>
+          <w:bCs/>
+        </w:rPr>
+        <w:t>Exacerbated by three factors</w:t>
+      </w:r>
+      <w:r>
+        <w:t>: upright posture, active/passive motion (regardless of direction), and moving visual stimuli or complex visual patterns</w:t>
+      </w:r>
+      <w:r>
+        <w:br/>
+      </w:r>
+      <w:r>
+        <w:br/>
+        <w:t xml:space="preserve">3. </w:t>
+      </w:r>
+      <w:r>
+        <w:rPr>
+          <w:b/>
+          <w:bCs/>
+        </w:rPr>
+        <w:t>Triggered by a precipitating event</w:t>
+      </w:r>
+      <w:r>
+        <w:t xml:space="preserve">: acute/episodic/chronic vestibular syndromes (BPPV, vestibular neuritis), vestibular migraine, panic/anxiety </w:t>
+      </w:r>
+      <w:r>
+        <w:lastRenderedPageBreak/>
+        <w:t>disorders, mild traumatic brain injury, stroke, dysautonomia, or psychological distress</w:t>
+      </w:r>
+      <w:r>
+        <w:br/>
+      </w:r>
+      <w:r>
+        <w:br/>
+        <w:t xml:space="preserve">4. </w:t>
+      </w:r>
+      <w:r>
+        <w:rPr>
+          <w:b/>
+          <w:bCs/>
+        </w:rPr>
+        <w:t>Significant distress or functional impairment</w:t>
+      </w:r>
+      <w:r>
+        <w:br/>
+      </w:r>
+      <w:r>
+        <w:br/>
+        <w:t xml:space="preserve">5. </w:t>
+      </w:r>
+      <w:r>
+        <w:rPr>
+          <w:b/>
+          <w:bCs/>
+        </w:rPr>
+        <w:t>Not better explained by another disorder</w:t>
+      </w:r>
+      <w:r>
+        <w:br/>
+      </w:r>
+      <w:r>
+        <w:br/>
+        <w:t>PPPD replaces older diagnostic terms including phobic postural vertigo, chronic subjective dizziness, visual vertigo, and space-motion discomfort.</w:t>
+      </w:r>
+      <w:hyperlink r:id="rId98" w:history="1">
+        <w:r>
+          <w:rPr>
+            <w:rStyle w:val="ae"/>
+          </w:rPr>
+          <w:t>[1]</w:t>
+        </w:r>
+      </w:hyperlink>
+      <w:hyperlink r:id="rId99" w:history="1">
+        <w:r>
+          <w:rPr>
+            <w:rStyle w:val="ae"/>
+          </w:rPr>
+          <w:t>[2]</w:t>
+        </w:r>
+      </w:hyperlink>
+      <w:r>
+        <w:br/>
+      </w:r>
+      <w:r>
+        <w:br/>
+      </w:r>
+      <w:r>
+        <w:rPr>
+          <w:b/>
+          <w:bCs/>
+        </w:rPr>
+        <w:t>Pathophysiology</w:t>
+      </w:r>
+      <w:r>
+        <w:br/>
+      </w:r>
+      <w:r>
+        <w:br/>
+        <w:t xml:space="preserve">The pathophysiology involves </w:t>
+      </w:r>
+      <w:r>
+        <w:rPr>
+          <w:b/>
+          <w:bCs/>
+        </w:rPr>
+        <w:t>maladaptive brain responses to an initial vestibular or balance disturbance that persist after the precipitating event resolves</w:t>
+      </w:r>
+      <w:r>
+        <w:t>.</w:t>
+      </w:r>
+      <w:hyperlink r:id="rId100" w:history="1">
+        <w:r>
+          <w:rPr>
+            <w:rStyle w:val="ae"/>
+          </w:rPr>
+          <w:t>[1]</w:t>
+        </w:r>
+      </w:hyperlink>
+      <w:hyperlink r:id="rId101" w:history="1">
+        <w:r>
+          <w:rPr>
+            <w:rStyle w:val="ae"/>
+          </w:rPr>
+          <w:t>[2]</w:t>
+        </w:r>
+      </w:hyperlink>
+      <w:hyperlink r:id="rId102" w:history="1">
+        <w:r>
+          <w:rPr>
+            <w:rStyle w:val="ae"/>
+          </w:rPr>
+          <w:t>[4]</w:t>
+        </w:r>
+      </w:hyperlink>
+      <w:r>
+        <w:t xml:space="preserve"> Current models emphasize three key mechanisms:</w:t>
+      </w:r>
+      <w:r>
+        <w:br/>
+      </w:r>
+      <w:r>
+        <w:br/>
+      </w:r>
+      <w:r>
+        <w:rPr>
+          <w:b/>
+          <w:bCs/>
+        </w:rPr>
+        <w:t>Psychological and behavioral responses</w:t>
+      </w:r>
+      <w:r>
+        <w:t>: Anxiety following vestibular injury, dependent personality traits, autonomic arousal, and increased body vigilance (conscious attention to internal cues) at the time of precipitating events initiate PPPD.</w:t>
+      </w:r>
+      <w:hyperlink r:id="rId103" w:history="1">
+        <w:r>
+          <w:rPr>
+            <w:rStyle w:val="ae"/>
+          </w:rPr>
+          <w:t>[5]</w:t>
+        </w:r>
+      </w:hyperlink>
+      <w:hyperlink r:id="rId104" w:history="1">
+        <w:r>
+          <w:rPr>
+            <w:rStyle w:val="ae"/>
+          </w:rPr>
+          <w:t>[3]</w:t>
+        </w:r>
+      </w:hyperlink>
+      <w:r>
+        <w:t xml:space="preserve"> Importantly, </w:t>
+      </w:r>
+      <w:r>
+        <w:rPr>
+          <w:b/>
+          <w:bCs/>
+        </w:rPr>
+        <w:t>the severity of structural vestibular deficits or compensation status does not predict PPPD development</w:t>
+      </w:r>
+      <w:r>
+        <w:t>—rather, psychological and behavioral responses are the primary predictors.</w:t>
+      </w:r>
+      <w:hyperlink r:id="rId105" w:history="1">
+        <w:r>
+          <w:rPr>
+            <w:rStyle w:val="ae"/>
+          </w:rPr>
+          <w:t>[5]</w:t>
+        </w:r>
+      </w:hyperlink>
+      <w:r>
+        <w:br/>
+      </w:r>
+      <w:r>
+        <w:br/>
+      </w:r>
+      <w:r>
+        <w:rPr>
+          <w:b/>
+          <w:bCs/>
+        </w:rPr>
+        <w:t>Altered postural control and sensory processing</w:t>
+      </w:r>
+      <w:r>
+        <w:t>: Patients develop functional shifts in stance and gait (stiffened postural control, widened base of support, shorter stride length) and become overly reliant on visual inputs versus vestibular and somatosensory inputs (visual dependence).</w:t>
+      </w:r>
+      <w:hyperlink r:id="rId106" w:history="1">
+        <w:r>
+          <w:rPr>
+            <w:rStyle w:val="ae"/>
+          </w:rPr>
+          <w:t>[3]</w:t>
+        </w:r>
+      </w:hyperlink>
+      <w:r>
+        <w:t xml:space="preserve"> The most recent pathophysiologic model proposes </w:t>
+      </w:r>
+      <w:r>
+        <w:rPr>
+          <w:b/>
+          <w:bCs/>
+        </w:rPr>
+        <w:t>prioritization of postural stability over fluid locomotion</w:t>
+      </w:r>
+      <w:r>
+        <w:t xml:space="preserve"> as the core mechanism.</w:t>
+      </w:r>
+      <w:hyperlink r:id="rId107" w:history="1">
+        <w:r>
+          <w:rPr>
+            <w:rStyle w:val="ae"/>
+          </w:rPr>
+          <w:t>[4]</w:t>
+        </w:r>
+      </w:hyperlink>
+      <w:r>
+        <w:br/>
+      </w:r>
+      <w:r>
+        <w:br/>
+      </w:r>
+      <w:r>
+        <w:rPr>
+          <w:b/>
+          <w:bCs/>
+        </w:rPr>
+        <w:t>Brain network alterations</w:t>
+      </w:r>
+      <w:r>
+        <w:t xml:space="preserve">: Neuroimaging studies demonstrate decreased functional connectivity centered on the hippocampus bilaterally, extending to inferior frontal gyrus, temporal lobes, insular cortices, and cerebellar regions, </w:t>
+      </w:r>
+      <w:r>
+        <w:lastRenderedPageBreak/>
+        <w:t xml:space="preserve">suggesting diminished integration of multisensory vestibular and spatial information processing. </w:t>
+      </w:r>
+      <w:hyperlink r:id="rId108" w:history="1">
+        <w:r>
+          <w:rPr>
+            <w:rStyle w:val="ae"/>
+          </w:rPr>
+          <w:t>[6]</w:t>
+        </w:r>
+      </w:hyperlink>
+      <w:r>
+        <w:br/>
+      </w:r>
+      <w:r>
+        <w:br/>
+      </w:r>
+      <w:r>
+        <w:drawing>
+          <wp:inline distT="0" distB="0" distL="0" distR="0" wp14:anchorId="6DACA638" wp14:editId="1D2EBBBD">
+            <wp:extent cx="5274310" cy="4817745"/>
+            <wp:effectExtent l="0" t="0" r="2540" b="1905"/>
+            <wp:docPr id="1327017631" name="圖片 4"/>
+            <wp:cNvGraphicFramePr>
+              <a:graphicFrameLocks xmlns:a="http://schemas.openxmlformats.org/drawingml/2006/main" noChangeAspect="1"/>
+            </wp:cNvGraphicFramePr>
+            <a:graphic xmlns:a="http://schemas.openxmlformats.org/drawingml/2006/main">
+              <a:graphicData uri="http://schemas.openxmlformats.org/drawingml/2006/picture">
+                <pic:pic xmlns:pic="http://schemas.openxmlformats.org/drawingml/2006/picture">
+                  <pic:nvPicPr>
+                    <pic:cNvPr id="0" name="Picture 11"/>
+                    <pic:cNvPicPr>
+                      <a:picLocks noChangeAspect="1" noChangeArrowheads="1"/>
+                    </pic:cNvPicPr>
+                  </pic:nvPicPr>
+                  <pic:blipFill>
+                    <a:blip r:embed="rId109">
+                      <a:extLst>
+                        <a:ext uri="{28A0092B-C50C-407E-A947-70E740481C1C}">
+                          <a14:useLocalDpi xmlns:a14="http://schemas.microsoft.com/office/drawing/2010/main" val="0"/>
+                        </a:ext>
+                      </a:extLst>
+                    </a:blip>
+                    <a:srcRect/>
+                    <a:stretch>
+                      <a:fillRect/>
+                    </a:stretch>
+                  </pic:blipFill>
+                  <pic:spPr bwMode="auto">
+                    <a:xfrm>
+                      <a:off x="0" y="0"/>
+                      <a:ext cx="5274310" cy="4817745"/>
+                    </a:xfrm>
+                    <a:prstGeom prst="rect">
+                      <a:avLst/>
+                    </a:prstGeom>
+                    <a:noFill/>
+                    <a:ln>
+                      <a:noFill/>
+                    </a:ln>
+                  </pic:spPr>
+                </pic:pic>
+              </a:graphicData>
+            </a:graphic>
+          </wp:inline>
+        </w:drawing>
+      </w:r>
+      <w:r>
+        <w:t>Figure 1 ROI</w:t>
+      </w:r>
+      <w:r>
+        <w:rPr>
+          <w:rFonts w:ascii="Cambria Math" w:hAnsi="Cambria Math" w:cs="Cambria Math"/>
+        </w:rPr>
+        <w:t>‐</w:t>
+      </w:r>
+      <w:r>
+        <w:t>to</w:t>
+      </w:r>
+      <w:r>
+        <w:rPr>
+          <w:rFonts w:ascii="Cambria Math" w:hAnsi="Cambria Math" w:cs="Cambria Math"/>
+        </w:rPr>
+        <w:t>‐</w:t>
+      </w:r>
+      <w:r>
+        <w:t>ROI analyses of the resting</w:t>
+      </w:r>
+      <w:r>
+        <w:rPr>
+          <w:rFonts w:ascii="Cambria Math" w:hAnsi="Cambria Math" w:cs="Cambria Math"/>
+        </w:rPr>
+        <w:t>‐</w:t>
+      </w:r>
+      <w:r>
+        <w:t xml:space="preserve">state fMRI in the whole brain. undefined </w:t>
+      </w:r>
+      <w:r>
+        <w:br/>
+      </w:r>
+      <w:r>
+        <w:br/>
+        <w:t xml:space="preserve">Notably, </w:t>
+      </w:r>
+      <w:r>
+        <w:rPr>
+          <w:b/>
+          <w:bCs/>
+        </w:rPr>
+        <w:t>neuroticism may predispose to PPPD</w:t>
+      </w:r>
+      <w:r>
+        <w:t>, but premorbid psychiatric comorbidities (other than dependent personality traits) are not relevant for development.</w:t>
+      </w:r>
+      <w:hyperlink r:id="rId110" w:history="1">
+        <w:r>
+          <w:rPr>
+            <w:rStyle w:val="ae"/>
+          </w:rPr>
+          <w:t>[5]</w:t>
+        </w:r>
+      </w:hyperlink>
+      <w:r>
+        <w:br/>
+      </w:r>
+      <w:r>
+        <w:br/>
+      </w:r>
+      <w:r>
+        <w:rPr>
+          <w:b/>
+          <w:bCs/>
+        </w:rPr>
+        <w:t>Treatment</w:t>
+      </w:r>
+      <w:r>
+        <w:br/>
+      </w:r>
+      <w:r>
+        <w:br/>
+      </w:r>
+      <w:proofErr w:type="spellStart"/>
+      <w:r>
+        <w:t>Treatment</w:t>
+      </w:r>
+      <w:proofErr w:type="spellEnd"/>
+      <w:r>
+        <w:t xml:space="preserve"> combines pharmacological and non-pharmacological approaches, with </w:t>
+      </w:r>
+      <w:r>
+        <w:rPr>
+          <w:b/>
+          <w:bCs/>
+        </w:rPr>
+        <w:t>combination therapy superior to monotherapy</w:t>
+      </w:r>
+      <w:r>
+        <w:t>.</w:t>
+      </w:r>
+      <w:hyperlink r:id="rId111" w:history="1">
+        <w:r>
+          <w:rPr>
+            <w:rStyle w:val="ae"/>
+          </w:rPr>
+          <w:t>[7]</w:t>
+        </w:r>
+      </w:hyperlink>
+      <w:r>
+        <w:br/>
+      </w:r>
+      <w:r>
+        <w:lastRenderedPageBreak/>
+        <w:br/>
+      </w:r>
+      <w:r>
+        <w:rPr>
+          <w:b/>
+          <w:bCs/>
+        </w:rPr>
+        <w:t>Vestibular rehabilitation therapy (VRT)</w:t>
+      </w:r>
+      <w:r>
+        <w:t xml:space="preserve"> is the cornerstone non-pharmacological treatment:</w:t>
+      </w:r>
+      <w:hyperlink r:id="rId112" w:history="1">
+        <w:r>
+          <w:rPr>
+            <w:rStyle w:val="ae"/>
+          </w:rPr>
+          <w:t>[1]</w:t>
+        </w:r>
+      </w:hyperlink>
+      <w:hyperlink r:id="rId113" w:history="1">
+        <w:r>
+          <w:rPr>
+            <w:rStyle w:val="ae"/>
+          </w:rPr>
+          <w:t>[8]</w:t>
+        </w:r>
+      </w:hyperlink>
+      <w:hyperlink r:id="rId114" w:history="1">
+        <w:r>
+          <w:rPr>
+            <w:rStyle w:val="ae"/>
+          </w:rPr>
+          <w:t>[9]</w:t>
+        </w:r>
+      </w:hyperlink>
+      <w:r>
+        <w:br/>
+      </w:r>
+      <w:r>
+        <w:br/>
+        <w:t>- Involves walking exercises, balance retraining, and visual/postural exercises tailored to individual symptoms</w:t>
+      </w:r>
+      <w:r>
+        <w:br/>
+      </w:r>
+      <w:r>
+        <w:br/>
+        <w:t>- Works through habituation (reducing abnormal balance signals) and promoting central compensation</w:t>
+      </w:r>
+      <w:r>
+        <w:br/>
+      </w:r>
+      <w:r>
+        <w:br/>
+        <w:t>- Significantly improves Dizziness Handicap Inventory (DHI) scores, with weighted mean difference of 21.84 points compared to controls</w:t>
+      </w:r>
+      <w:hyperlink r:id="rId115" w:history="1">
+        <w:r>
+          <w:rPr>
+            <w:rStyle w:val="ae"/>
+          </w:rPr>
+          <w:t>[9]</w:t>
+        </w:r>
+      </w:hyperlink>
+      <w:r>
+        <w:br/>
+      </w:r>
+      <w:r>
+        <w:br/>
+        <w:t>- Both customized VRT and virtual reality-based VRT are effective, though customized VRT shows superior efficacy</w:t>
+      </w:r>
+      <w:hyperlink r:id="rId116" w:history="1">
+        <w:r>
+          <w:rPr>
+            <w:rStyle w:val="ae"/>
+          </w:rPr>
+          <w:t>[9]</w:t>
+        </w:r>
+      </w:hyperlink>
+      <w:r>
+        <w:br/>
+      </w:r>
+      <w:r>
+        <w:br/>
+        <w:t>- Home-based VRT is as effective as hospital-based therapy and should be considered a treatment option</w:t>
+      </w:r>
+      <w:hyperlink r:id="rId117" w:history="1">
+        <w:r>
+          <w:rPr>
+            <w:rStyle w:val="ae"/>
+          </w:rPr>
+          <w:t>[8]</w:t>
+        </w:r>
+      </w:hyperlink>
+      <w:r>
+        <w:br/>
+      </w:r>
+      <w:r>
+        <w:br/>
+        <w:t>- Improvements seen in DHI-Physical, DHI-Emotional, and DHI-Functional subscales</w:t>
+      </w:r>
+      <w:hyperlink r:id="rId118" w:history="1">
+        <w:r>
+          <w:rPr>
+            <w:rStyle w:val="ae"/>
+          </w:rPr>
+          <w:t>[9]</w:t>
+        </w:r>
+      </w:hyperlink>
+      <w:r>
+        <w:br/>
+      </w:r>
+      <w:r>
+        <w:br/>
+      </w:r>
+      <w:r>
+        <w:rPr>
+          <w:b/>
+          <w:bCs/>
+        </w:rPr>
+        <w:t>Pharmacological therapy</w:t>
+      </w:r>
+      <w:r>
+        <w:t>:</w:t>
+      </w:r>
+      <w:hyperlink r:id="rId119" w:history="1">
+        <w:r>
+          <w:rPr>
+            <w:rStyle w:val="ae"/>
+          </w:rPr>
+          <w:t>[2]</w:t>
+        </w:r>
+      </w:hyperlink>
+      <w:hyperlink r:id="rId120" w:history="1">
+        <w:r>
+          <w:rPr>
+            <w:rStyle w:val="ae"/>
+          </w:rPr>
+          <w:t>[7]</w:t>
+        </w:r>
+      </w:hyperlink>
+      <w:r>
+        <w:br/>
+      </w:r>
+      <w:r>
+        <w:br/>
+        <w:t xml:space="preserve">- </w:t>
+      </w:r>
+      <w:r>
+        <w:rPr>
+          <w:b/>
+          <w:bCs/>
+        </w:rPr>
+        <w:t>SSRIs (selective serotonin reuptake inhibitors)</w:t>
+      </w:r>
+      <w:r>
+        <w:t xml:space="preserve"> and </w:t>
+      </w:r>
+      <w:r>
+        <w:rPr>
+          <w:b/>
+          <w:bCs/>
+        </w:rPr>
+        <w:t>SNRIs (serotonin-norepinephrine reuptake inhibitors)</w:t>
+      </w:r>
+      <w:r>
+        <w:t xml:space="preserve"> are first-line medications</w:t>
+      </w:r>
+      <w:r>
+        <w:br/>
+      </w:r>
+      <w:r>
+        <w:br/>
+        <w:t xml:space="preserve">- </w:t>
+      </w:r>
+      <w:r>
+        <w:rPr>
+          <w:b/>
+          <w:bCs/>
+        </w:rPr>
+        <w:t>Combination of SSRI plus VRT</w:t>
+      </w:r>
+      <w:r>
+        <w:t xml:space="preserve"> shows significantly greater improvement in DHI and Hamilton Anxiety Scale scores compared to either therapy alone</w:t>
+      </w:r>
+      <w:hyperlink r:id="rId121" w:history="1">
+        <w:r>
+          <w:rPr>
+            <w:rStyle w:val="ae"/>
+          </w:rPr>
+          <w:t>[7]</w:t>
+        </w:r>
+      </w:hyperlink>
+      <w:r>
+        <w:br/>
+      </w:r>
+      <w:r>
+        <w:br/>
+        <w:t xml:space="preserve">- Current evidence recommends prioritizing </w:t>
+      </w:r>
+      <w:r>
+        <w:rPr>
+          <w:b/>
+          <w:bCs/>
+        </w:rPr>
+        <w:t>SSRI plus structured VRT</w:t>
+      </w:r>
+      <w:r>
+        <w:t xml:space="preserve"> as the treatment option for PPPD</w:t>
+      </w:r>
+      <w:hyperlink r:id="rId122" w:history="1">
+        <w:r>
+          <w:rPr>
+            <w:rStyle w:val="ae"/>
+          </w:rPr>
+          <w:t>[7]</w:t>
+        </w:r>
+      </w:hyperlink>
+      <w:r>
+        <w:br/>
+      </w:r>
+      <w:r>
+        <w:br/>
+      </w:r>
+      <w:r>
+        <w:rPr>
+          <w:b/>
+          <w:bCs/>
+        </w:rPr>
+        <w:lastRenderedPageBreak/>
+        <w:t>Cognitive behavioral therapy (CBT)</w:t>
+      </w:r>
+      <w:r>
+        <w:t>:</w:t>
+      </w:r>
+      <w:hyperlink r:id="rId123" w:history="1">
+        <w:r>
+          <w:rPr>
+            <w:rStyle w:val="ae"/>
+          </w:rPr>
+          <w:t>[1]</w:t>
+        </w:r>
+      </w:hyperlink>
+      <w:hyperlink r:id="rId124" w:history="1">
+        <w:r>
+          <w:rPr>
+            <w:rStyle w:val="ae"/>
+          </w:rPr>
+          <w:t>[7]</w:t>
+        </w:r>
+      </w:hyperlink>
+      <w:r>
+        <w:br/>
+      </w:r>
+      <w:r>
+        <w:br/>
+        <w:t>- Addresses anxiety and mood disturbance common in PPPD</w:t>
+      </w:r>
+      <w:r>
+        <w:br/>
+      </w:r>
+      <w:r>
+        <w:br/>
+        <w:t xml:space="preserve">- </w:t>
+      </w:r>
+      <w:r>
+        <w:rPr>
+          <w:b/>
+          <w:bCs/>
+        </w:rPr>
+        <w:t>Sertraline plus CBT</w:t>
+      </w:r>
+      <w:r>
+        <w:t xml:space="preserve"> shows significantly lower DHI scores at weeks 4 and 8 compared to sertraline alone </w:t>
+      </w:r>
+      <w:hyperlink r:id="rId125" w:history="1">
+        <w:r>
+          <w:rPr>
+            <w:rStyle w:val="ae"/>
+          </w:rPr>
+          <w:t>[10]</w:t>
+        </w:r>
+      </w:hyperlink>
+      <w:r>
+        <w:br/>
+      </w:r>
+      <w:r>
+        <w:br/>
+      </w:r>
+      <w:r>
+        <w:drawing>
+          <wp:inline distT="0" distB="0" distL="0" distR="0" wp14:anchorId="1371A1C4" wp14:editId="68BFE0EF">
+            <wp:extent cx="5274310" cy="3532505"/>
+            <wp:effectExtent l="0" t="0" r="2540" b="0"/>
+            <wp:docPr id="192584833" name="圖片 3"/>
+            <wp:cNvGraphicFramePr>
+              <a:graphicFrameLocks xmlns:a="http://schemas.openxmlformats.org/drawingml/2006/main" noChangeAspect="1"/>
+            </wp:cNvGraphicFramePr>
+            <a:graphic xmlns:a="http://schemas.openxmlformats.org/drawingml/2006/main">
+              <a:graphicData uri="http://schemas.openxmlformats.org/drawingml/2006/picture">
+                <pic:pic xmlns:pic="http://schemas.openxmlformats.org/drawingml/2006/picture">
+                  <pic:nvPicPr>
+                    <pic:cNvPr id="0" name="Picture 12"/>
+                    <pic:cNvPicPr>
+                      <a:picLocks noChangeAspect="1" noChangeArrowheads="1"/>
+                    </pic:cNvPicPr>
+                  </pic:nvPicPr>
+                  <pic:blipFill>
+                    <a:blip r:embed="rId126">
+                      <a:extLst>
+                        <a:ext uri="{28A0092B-C50C-407E-A947-70E740481C1C}">
+                          <a14:useLocalDpi xmlns:a14="http://schemas.microsoft.com/office/drawing/2010/main" val="0"/>
+                        </a:ext>
+                      </a:extLst>
+                    </a:blip>
+                    <a:srcRect/>
+                    <a:stretch>
+                      <a:fillRect/>
+                    </a:stretch>
+                  </pic:blipFill>
+                  <pic:spPr bwMode="auto">
+                    <a:xfrm>
+                      <a:off x="0" y="0"/>
+                      <a:ext cx="5274310" cy="3532505"/>
+                    </a:xfrm>
+                    <a:prstGeom prst="rect">
+                      <a:avLst/>
+                    </a:prstGeom>
+                    <a:noFill/>
+                    <a:ln>
+                      <a:noFill/>
+                    </a:ln>
+                  </pic:spPr>
+                </pic:pic>
+              </a:graphicData>
+            </a:graphic>
+          </wp:inline>
+        </w:drawing>
+      </w:r>
+      <w:r>
+        <w:t xml:space="preserve">Figure 1 undefined </w:t>
+      </w:r>
+      <w:r>
+        <w:br/>
+      </w:r>
+      <w:r>
+        <w:br/>
+        <w:t>- Helps patients understand and cope with symptoms more easily</w:t>
+      </w:r>
+      <w:r>
+        <w:br/>
+      </w:r>
+      <w:r>
+        <w:br/>
+        <w:t>- Evidence for CBT is limited but promising</w:t>
+      </w:r>
+      <w:hyperlink r:id="rId127" w:history="1">
+        <w:r>
+          <w:rPr>
+            <w:rStyle w:val="ae"/>
+          </w:rPr>
+          <w:t>[7]</w:t>
+        </w:r>
+      </w:hyperlink>
+      <w:r>
+        <w:br/>
+      </w:r>
+      <w:r>
+        <w:br/>
+      </w:r>
+      <w:r>
+        <w:rPr>
+          <w:b/>
+          <w:bCs/>
+        </w:rPr>
+        <w:t>Other therapies</w:t>
+      </w:r>
+      <w:r>
+        <w:t>: Transcranial direct current stimulation (</w:t>
+      </w:r>
+      <w:proofErr w:type="spellStart"/>
+      <w:r>
+        <w:t>tDCS</w:t>
+      </w:r>
+      <w:proofErr w:type="spellEnd"/>
+      <w:r>
+        <w:t>) has been studied but evidence remains unclear due to limited trials and small sample sizes.</w:t>
+      </w:r>
+      <w:hyperlink r:id="rId128" w:history="1">
+        <w:r>
+          <w:rPr>
+            <w:rStyle w:val="ae"/>
+          </w:rPr>
+          <w:t>[7]</w:t>
+        </w:r>
+      </w:hyperlink>
+      <w:r>
+        <w:br/>
+      </w:r>
+      <w:r>
+        <w:br/>
+      </w:r>
+      <w:r>
+        <w:rPr>
+          <w:b/>
+          <w:bCs/>
+        </w:rPr>
+        <w:t>Treatment Timeline</w:t>
+      </w:r>
+      <w:r>
+        <w:t>: Significant improvements in quality of life, dizziness handicap, depression, and anxiety levels occur within 3 months of VRT.</w:t>
+      </w:r>
+      <w:hyperlink r:id="rId129" w:history="1">
+        <w:r>
+          <w:rPr>
+            <w:rStyle w:val="ae"/>
+          </w:rPr>
+          <w:t>[8]</w:t>
+        </w:r>
+      </w:hyperlink>
+      <w:r>
+        <w:t xml:space="preserve"> </w:t>
+      </w:r>
+      <w:r>
+        <w:lastRenderedPageBreak/>
+        <w:t>Benefits of combined SSRI-CBT therapy become apparent after several weeks of treatment.</w:t>
+      </w:r>
+      <w:hyperlink r:id="rId130" w:history="1">
+        <w:r>
+          <w:rPr>
+            <w:rStyle w:val="ae"/>
+          </w:rPr>
+          <w:t>[10]</w:t>
+        </w:r>
+      </w:hyperlink>
+      <w:r>
+        <w:br/>
+      </w:r>
+      <w:r>
+        <w:br/>
+        <w:t>Would you like to explore how to differentiate PPPD from other chronic vestibular disorders in the clinical setting, or discuss specific vestibular rehabilitation protocols for PPPD?</w:t>
+      </w:r>
+    </w:p>
+    <w:p>
+      <w:pPr>
+        <w:rPr>
+          <w:b/>
+          <w:bCs/>
+        </w:rPr>
+      </w:pPr>
+      <w:r>
+        <w:rPr>
+          <w:b/>
+          <w:bCs/>
+        </w:rPr>
+        <w:t>References</w:t>
+      </w:r>
+    </w:p>
+    <w:p>
+      <w:pPr>
+        <w:numPr>
+          <w:ilvl w:val="0"/>
+          <w:numId w:val="4"/>
+        </w:numPr>
+      </w:pPr>
+      <w:hyperlink r:id="rId131" w:history="1">
+        <w:r>
+          <w:rPr>
+            <w:rStyle w:val="ae"/>
+          </w:rPr>
+          <w:t>Non-Pharmacological Interventions for Persistent Postural-Perceptual Dizziness (PPPD)</w:t>
+        </w:r>
+      </w:hyperlink>
+      <w:r>
+        <w:t>. Webster KE, Kamo T, Smith L, et al. The Cochrane Database of Systematic Reviews. 2023;3:CD015333. doi:10.1002/14651858.CD015333.pub2.</w:t>
+      </w:r>
+    </w:p>
+    <w:p>
+      <w:pPr>
+        <w:numPr>
+          <w:ilvl w:val="0"/>
+          <w:numId w:val="4"/>
+        </w:numPr>
+      </w:pPr>
+      <w:hyperlink r:id="rId132" w:history="1">
+        <w:r>
+          <w:rPr>
+            <w:rStyle w:val="ae"/>
+          </w:rPr>
+          <w:t>Pharmacological Interventions for Persistent Postural-Perceptual Dizziness (PPPD)</w:t>
+        </w:r>
+      </w:hyperlink>
+      <w:r>
+        <w:t>. Webster KE, Harrington-Benton NA, Judd O, et al. The Cochrane Database of Systematic Reviews. 2023;3:CD015188. doi:10.1002/14651858.CD015188.pub2.</w:t>
+      </w:r>
+    </w:p>
+    <w:p>
+      <w:pPr>
+        <w:numPr>
+          <w:ilvl w:val="0"/>
+          <w:numId w:val="4"/>
+        </w:numPr>
+      </w:pPr>
+      <w:hyperlink r:id="rId133" w:history="1">
+        <w:r>
+          <w:rPr>
+            <w:rStyle w:val="ae"/>
+          </w:rPr>
+          <w:t>Functional Neurological Disorder: New Subtypes and Shared Mechanisms</w:t>
+        </w:r>
+      </w:hyperlink>
+      <w:r>
+        <w:t xml:space="preserve">. Hallett M, Aybek S, </w:t>
+      </w:r>
+      <w:proofErr w:type="spellStart"/>
+      <w:r>
+        <w:t>Dworetzky</w:t>
+      </w:r>
+      <w:proofErr w:type="spellEnd"/>
+      <w:r>
+        <w:t xml:space="preserve"> BA, et al. The Lancet. Neurology. 2022;21(6):537-550. doi:10.1016/S1474-4422(21)00422-1.</w:t>
+      </w:r>
+    </w:p>
+    <w:p>
+      <w:pPr>
+        <w:numPr>
+          <w:ilvl w:val="0"/>
+          <w:numId w:val="4"/>
+        </w:numPr>
+      </w:pPr>
+      <w:hyperlink r:id="rId134" w:history="1">
+        <w:r>
+          <w:rPr>
+            <w:rStyle w:val="ae"/>
+          </w:rPr>
+          <w:t>Persistent Postural-Perceptual Dizziness: Review and Update on Key Mechanisms of the Most Common Functional Neuro-Otologic Disorder</w:t>
+        </w:r>
+      </w:hyperlink>
+      <w:r>
+        <w:t>. Staab JP. Neurologic Clinics. 2023;41(4):647-664. doi:10.1016/j.ncl.2023.04.003.</w:t>
+      </w:r>
+    </w:p>
+    <w:p>
+      <w:pPr>
+        <w:numPr>
+          <w:ilvl w:val="0"/>
+          <w:numId w:val="4"/>
+        </w:numPr>
+      </w:pPr>
+      <w:hyperlink r:id="rId135" w:history="1">
+        <w:r>
+          <w:rPr>
+            <w:rStyle w:val="ae"/>
+          </w:rPr>
+          <w:t>Predictors of Persistent Postural-Perceptual Dizziness (PPPD) and Similar Forms of Chronic Dizziness Precipitated by Peripheral Vestibular Disorders: A Systematic Review</w:t>
+        </w:r>
+      </w:hyperlink>
+      <w:r>
+        <w:t>. Trinidade A, Cabreira V, Goebel JA, et al. Journal of Neurology, Neurosurgery, and Psychiatry. 2023;94(11):904-915. doi:10.1136/jnnp-2022-330196.</w:t>
+      </w:r>
+    </w:p>
+    <w:p>
+      <w:pPr>
+        <w:numPr>
+          <w:ilvl w:val="0"/>
+          <w:numId w:val="4"/>
+        </w:numPr>
+      </w:pPr>
+      <w:hyperlink r:id="rId136" w:history="1">
+        <w:r>
+          <w:rPr>
+            <w:rStyle w:val="ae"/>
+          </w:rPr>
+          <w:t>Altered brain function in persistent postural perceptual dizziness: A study on resting state functional connectivity</w:t>
+        </w:r>
+      </w:hyperlink>
+      <w:r>
+        <w:t>. Lee JO, Lee ES, Kim JS, et al. Human Brain Mapping. 2018;39(8):3340-3353. doi:10.1002/hbm.24080.</w:t>
+      </w:r>
+    </w:p>
+    <w:p>
+      <w:pPr>
+        <w:numPr>
+          <w:ilvl w:val="0"/>
+          <w:numId w:val="4"/>
+        </w:numPr>
+      </w:pPr>
+      <w:hyperlink r:id="rId137" w:history="1">
+        <w:r>
+          <w:rPr>
+            <w:rStyle w:val="ae"/>
+          </w:rPr>
+          <w:t>Effect of Conservative Therapy for Persistent Postural-Perceptual Dizziness: A Systematic Review and Meta-Analysis</w:t>
+        </w:r>
+      </w:hyperlink>
+      <w:r>
+        <w:t>. Zheng Y, Guo Z, Liu X, et al. Frontiers in Psychiatry. 2025;16:1676218. doi:10.3389/fpsyt.2025.1676218.</w:t>
+      </w:r>
+    </w:p>
+    <w:p>
+      <w:pPr>
+        <w:numPr>
+          <w:ilvl w:val="0"/>
+          <w:numId w:val="4"/>
+        </w:numPr>
+      </w:pPr>
+      <w:hyperlink r:id="rId138" w:history="1">
+        <w:r>
+          <w:rPr>
+            <w:rStyle w:val="ae"/>
+          </w:rPr>
+          <w:t>Home-Based Vestibular Rehabilitation: A Feasible and Effective Therapy for Persistent Postural Perceptual Dizziness (A Pilot Study)</w:t>
+        </w:r>
+      </w:hyperlink>
+      <w:r>
+        <w:t>. Teh CS, Abdullah NA, Kamaruddin NR, et al. The Annals of Otology, Rhinology, and Laryngology. 2023;132(5):566-577. doi:10.1177/00034894221111408.</w:t>
+      </w:r>
+    </w:p>
+    <w:p>
+      <w:pPr>
+        <w:numPr>
+          <w:ilvl w:val="0"/>
+          <w:numId w:val="4"/>
+        </w:numPr>
+      </w:pPr>
+      <w:hyperlink r:id="rId139" w:history="1">
+        <w:r>
+          <w:rPr>
+            <w:rStyle w:val="ae"/>
+          </w:rPr>
+          <w:t>Effect of Vestibular Rehabilitation Therapy in Patients With Persistent Postural Perceptual Dizziness: A Systematic Review and Meta-Analysis</w:t>
+        </w:r>
+      </w:hyperlink>
+      <w:r>
+        <w:t>. Li Y, Pei X, Ding R, et al. Frontiers in Neurology. 2025;16:1599201. doi:10.3389/fneur.2025.1599201.</w:t>
+      </w:r>
+    </w:p>
+    <w:p>
+      <w:pPr>
+        <w:numPr>
+          <w:ilvl w:val="0"/>
+          <w:numId w:val="4"/>
+        </w:numPr>
+      </w:pPr>
+      <w:hyperlink r:id="rId140" w:history="1">
+        <w:r>
+          <w:rPr>
+            <w:rStyle w:val="ae"/>
+          </w:rPr>
+          <w:t>Cognitive Behavior Therapy as Augmentation for Sertraline in Treating Patients with Persistent Postural</w:t>
+        </w:r>
+        <w:r>
+          <w:rPr>
+            <w:rStyle w:val="ae"/>
+            <w:rFonts w:ascii="Cambria Math" w:hAnsi="Cambria Math" w:cs="Cambria Math"/>
+          </w:rPr>
+          <w:t>‐</w:t>
+        </w:r>
+        <w:r>
+          <w:rPr>
+            <w:rStyle w:val="ae"/>
+          </w:rPr>
+          <w:t>Perceptual Dizziness</w:t>
+        </w:r>
+      </w:hyperlink>
+      <w:r>
+        <w:t>. Yu YC, Xue H, Zhang YX, Zhou J. BioMed Research International. 2018;2018:8518631. doi:10.1155/2018/8518631.</w:t>
+      </w:r>
+    </w:p>
+    <w:p>
+      <w:r>
+        <w:rPr>
+          <w:b/>
+          <w:bCs/>
+        </w:rPr>
+        <w:t>Chronic use of anti-vertigo medications (meclizine, diphenidol, flunarizine) does not provide sustained benefit for dizziness and is generally not recommended.</w:t>
+      </w:r>
+      <w:r>
+        <w:t xml:space="preserve"> These medications should be used only for </w:t>
+      </w:r>
+      <w:r>
+        <w:rPr>
+          <w:b/>
+          <w:bCs/>
+        </w:rPr>
+        <w:t>acute symptom control for several days</w:t>
+      </w:r>
+      <w:r>
+        <w:t>, not as long-term therapy.</w:t>
+      </w:r>
+      <w:hyperlink r:id="rId141" w:history="1">
+        <w:r>
+          <w:rPr>
+            <w:rStyle w:val="ae"/>
+          </w:rPr>
+          <w:t>[1]</w:t>
+        </w:r>
+      </w:hyperlink>
+      <w:hyperlink r:id="rId142" w:history="1">
+        <w:r>
+          <w:rPr>
+            <w:rStyle w:val="ae"/>
+          </w:rPr>
+          <w:t>[2]</w:t>
+        </w:r>
+      </w:hyperlink>
+      <w:r>
+        <w:br/>
+      </w:r>
+      <w:r>
+        <w:br/>
+      </w:r>
+      <w:r>
+        <w:rPr>
+          <w:b/>
+          <w:bCs/>
+        </w:rPr>
+        <w:t>Evidence for Chronic Use</w:t>
+      </w:r>
+      <w:r>
+        <w:br/>
+      </w:r>
+      <w:r>
+        <w:br/>
+      </w:r>
+      <w:r>
+        <w:rPr>
+          <w:b/>
+          <w:bCs/>
+        </w:rPr>
+        <w:t>Meclizine and antihistamines</w:t>
+      </w:r>
+      <w:r>
+        <w:t xml:space="preserve">: A 2022 systematic review and meta-analysis found that </w:t>
+      </w:r>
+      <w:r>
+        <w:rPr>
+          <w:b/>
+          <w:bCs/>
+        </w:rPr>
+        <w:t>daily enteral use of antihistamines is not superior to placebo or no medication</w:t>
+      </w:r>
+      <w:r>
+        <w:t xml:space="preserve"> for improving or resolving vertigo at 1 week or 1 month (low-quality evidence).</w:t>
+      </w:r>
+      <w:hyperlink r:id="rId143" w:history="1">
+        <w:r>
+          <w:rPr>
+            <w:rStyle w:val="ae"/>
+          </w:rPr>
+          <w:t>[3]</w:t>
+        </w:r>
+      </w:hyperlink>
+      <w:r>
+        <w:t xml:space="preserve"> While single-dose antihistamines may provide short-term relief at 2 hours, this benefit does not translate to chronic use.</w:t>
+      </w:r>
+      <w:hyperlink r:id="rId144" w:history="1">
+        <w:r>
+          <w:rPr>
+            <w:rStyle w:val="ae"/>
+          </w:rPr>
+          <w:t>[3]</w:t>
+        </w:r>
+      </w:hyperlink>
+      <w:r>
+        <w:br/>
+      </w:r>
+      <w:r>
+        <w:br/>
+      </w:r>
+      <w:r>
+        <w:rPr>
+          <w:b/>
+          <w:bCs/>
+        </w:rPr>
+        <w:t>Diphenidol</w:t>
+      </w:r>
+      <w:r>
+        <w:t xml:space="preserve">: Limited evidence exists for chronic diphenidol use. One small study (22 patients) treated with diphenidol 75 mg/day for 4 weeks showed improvement in physical symptoms but </w:t>
+      </w:r>
+      <w:r>
+        <w:rPr>
+          <w:b/>
+          <w:bCs/>
+        </w:rPr>
+        <w:t xml:space="preserve">no improvement in emotional factors </w:t>
+      </w:r>
+      <w:r>
+        <w:rPr>
+          <w:b/>
+          <w:bCs/>
+        </w:rPr>
+        <w:lastRenderedPageBreak/>
+        <w:t>or anxiety</w:t>
+      </w:r>
+      <w:r>
+        <w:t xml:space="preserve"> compared to </w:t>
+      </w:r>
+      <w:proofErr w:type="spellStart"/>
+      <w:r>
+        <w:t>betahistine</w:t>
+      </w:r>
+      <w:proofErr w:type="spellEnd"/>
+      <w:r>
+        <w:t>.</w:t>
+      </w:r>
+      <w:hyperlink r:id="rId145" w:history="1">
+        <w:r>
+          <w:rPr>
+            <w:rStyle w:val="ae"/>
+          </w:rPr>
+          <w:t>[4]</w:t>
+        </w:r>
+      </w:hyperlink>
+      <w:r>
+        <w:t xml:space="preserve"> Diphenidol improved two physical factors but was inferior to anti-anxiety medications for overall symptom management in chronic vestibular patients.</w:t>
+      </w:r>
+      <w:hyperlink r:id="rId146" w:history="1">
+        <w:r>
+          <w:rPr>
+            <w:rStyle w:val="ae"/>
+          </w:rPr>
+          <w:t>[4]</w:t>
+        </w:r>
+      </w:hyperlink>
+      <w:r>
+        <w:br/>
+      </w:r>
+      <w:r>
+        <w:br/>
+      </w:r>
+      <w:r>
+        <w:rPr>
+          <w:b/>
+          <w:bCs/>
+        </w:rPr>
+        <w:t>Flunarizine</w:t>
+      </w:r>
+      <w:r>
+        <w:t>: Evidence for chronic flunarizine use is very low certainty. While flunarizine (10 mg daily for 2-3 months) may reduce vertigo frequency and improve symptoms in vestibular migraine, the evidence comes from small studies with wide confidence intervals.</w:t>
+      </w:r>
+      <w:hyperlink r:id="rId147" w:history="1">
+        <w:r>
+          <w:rPr>
+            <w:rStyle w:val="ae"/>
+          </w:rPr>
+          <w:t>[5]</w:t>
+        </w:r>
+      </w:hyperlink>
+      <w:hyperlink r:id="rId148" w:history="1">
+        <w:r>
+          <w:rPr>
+            <w:rStyle w:val="ae"/>
+          </w:rPr>
+          <w:t>[6]</w:t>
+        </w:r>
+      </w:hyperlink>
+      <w:hyperlink r:id="rId149" w:history="1">
+        <w:r>
+          <w:rPr>
+            <w:rStyle w:val="ae"/>
+          </w:rPr>
+          <w:t>[7]</w:t>
+        </w:r>
+      </w:hyperlink>
+      <w:r>
+        <w:t xml:space="preserve"> Flunarizine showed efficacy specifically for </w:t>
+      </w:r>
+      <w:r>
+        <w:rPr>
+          <w:b/>
+          <w:bCs/>
+        </w:rPr>
+        <w:t>vestibular migraine prophylaxis</w:t>
+      </w:r>
+      <w:r>
+        <w:t>, not for general chronic dizziness.</w:t>
+      </w:r>
+      <w:hyperlink r:id="rId150" w:history="1">
+        <w:r>
+          <w:rPr>
+            <w:rStyle w:val="ae"/>
+          </w:rPr>
+          <w:t>[6]</w:t>
+        </w:r>
+      </w:hyperlink>
+      <w:hyperlink r:id="rId151" w:history="1">
+        <w:r>
+          <w:rPr>
+            <w:rStyle w:val="ae"/>
+          </w:rPr>
+          <w:t>[8]</w:t>
+        </w:r>
+      </w:hyperlink>
+      <w:hyperlink r:id="rId152" w:history="1">
+        <w:r>
+          <w:rPr>
+            <w:rStyle w:val="ae"/>
+          </w:rPr>
+          <w:t>[7]</w:t>
+        </w:r>
+      </w:hyperlink>
+      <w:r>
+        <w:t xml:space="preserve"> Side effects include weight gain and drowsiness.</w:t>
+      </w:r>
+      <w:hyperlink r:id="rId153" w:history="1">
+        <w:r>
+          <w:rPr>
+            <w:rStyle w:val="ae"/>
+          </w:rPr>
+          <w:t>[5]</w:t>
+        </w:r>
+      </w:hyperlink>
+      <w:hyperlink r:id="rId154" w:history="1">
+        <w:r>
+          <w:rPr>
+            <w:rStyle w:val="ae"/>
+          </w:rPr>
+          <w:t>[7]</w:t>
+        </w:r>
+      </w:hyperlink>
+      <w:r>
+        <w:br/>
+      </w:r>
+      <w:r>
+        <w:br/>
+      </w:r>
+      <w:r>
+        <w:rPr>
+          <w:b/>
+          <w:bCs/>
+        </w:rPr>
+        <w:t>Why Chronic Use is Harmful</w:t>
+      </w:r>
+      <w:r>
+        <w:br/>
+      </w:r>
+      <w:r>
+        <w:br/>
+        <w:t>Multiple guidelines explicitly discourage chronic vestibular suppressant use for several critical reasons:</w:t>
+      </w:r>
+      <w:r>
+        <w:br/>
+      </w:r>
+      <w:r>
+        <w:br/>
+      </w:r>
+      <w:r>
+        <w:rPr>
+          <w:b/>
+          <w:bCs/>
+        </w:rPr>
+        <w:t>Inhibition of central compensation</w:t>
+      </w:r>
+      <w:r>
+        <w:t xml:space="preserve">: The American Academy of Otolaryngology states that </w:t>
+      </w:r>
+      <w:r>
+        <w:rPr>
+          <w:b/>
+          <w:bCs/>
+        </w:rPr>
+        <w:t>chronic use of vestibular suppressants suppresses central adaptation/compensation to vestibular loss and can perpetuate symptoms of chronic imbalance</w:t>
+      </w:r>
+      <w:r>
+        <w:t>.</w:t>
+      </w:r>
+      <w:hyperlink r:id="rId155" w:history="1">
+        <w:r>
+          <w:rPr>
+            <w:rStyle w:val="ae"/>
+          </w:rPr>
+          <w:t>[2]</w:t>
+        </w:r>
+      </w:hyperlink>
+      <w:r>
+        <w:t xml:space="preserve"> This is the primary mechanism by which these medications worsen long-term outcomes—they prevent the brain from naturally adapting to vestibular dysfunction.</w:t>
+      </w:r>
+      <w:hyperlink r:id="rId156" w:history="1">
+        <w:r>
+          <w:rPr>
+            <w:rStyle w:val="ae"/>
+          </w:rPr>
+          <w:t>[1]</w:t>
+        </w:r>
+      </w:hyperlink>
+      <w:hyperlink r:id="rId157" w:history="1">
+        <w:r>
+          <w:rPr>
+            <w:rStyle w:val="ae"/>
+          </w:rPr>
+          <w:t>[2]</w:t>
+        </w:r>
+      </w:hyperlink>
+      <w:r>
+        <w:br/>
+      </w:r>
+      <w:r>
+        <w:br/>
+      </w:r>
+      <w:r>
+        <w:rPr>
+          <w:b/>
+          <w:bCs/>
+        </w:rPr>
+        <w:t>Lack of efficacy</w:t>
+      </w:r>
+      <w:r>
+        <w:t xml:space="preserve">: The Society for Academic Emergency Medicine (GRACE-3 guidelines) notes that </w:t>
+      </w:r>
+      <w:r>
+        <w:rPr>
+          <w:b/>
+          <w:bCs/>
+        </w:rPr>
+        <w:t>longer use beyond several days is discouraged</w:t>
+      </w:r>
+      <w:r>
+        <w:t xml:space="preserve"> due to both inhibition of physiological compensation and side effects.</w:t>
+      </w:r>
+      <w:hyperlink r:id="rId158" w:history="1">
+        <w:r>
+          <w:rPr>
+            <w:rStyle w:val="ae"/>
+          </w:rPr>
+          <w:t>[1]</w:t>
+        </w:r>
+      </w:hyperlink>
+      <w:r>
+        <w:t xml:space="preserve"> The American Academy of Otolaryngology-Head and Neck Surgery guidelines for BPPV explicitly </w:t>
+      </w:r>
+      <w:r>
+        <w:rPr>
+          <w:b/>
+          <w:bCs/>
+        </w:rPr>
+        <w:t>discourage the use of vestibular suppressants</w:t>
+      </w:r>
+      <w:r>
+        <w:t xml:space="preserve"> and recommend against their routine use.</w:t>
+      </w:r>
+      <w:hyperlink r:id="rId159" w:history="1">
+        <w:r>
+          <w:rPr>
+            <w:rStyle w:val="ae"/>
+          </w:rPr>
+          <w:t>[1]</w:t>
+        </w:r>
+      </w:hyperlink>
+      <w:hyperlink r:id="rId160" w:history="1">
+        <w:r>
+          <w:rPr>
+            <w:rStyle w:val="ae"/>
+          </w:rPr>
+          <w:t>[9]</w:t>
+        </w:r>
+      </w:hyperlink>
+      <w:r>
+        <w:br/>
+      </w:r>
+      <w:r>
+        <w:br/>
+      </w:r>
+      <w:r>
+        <w:rPr>
+          <w:b/>
+          <w:bCs/>
+        </w:rPr>
+        <w:t>Adverse effects</w:t>
+      </w:r>
+      <w:r>
+        <w:t>:</w:t>
+      </w:r>
+      <w:hyperlink r:id="rId161" w:history="1">
+        <w:r>
+          <w:rPr>
+            <w:rStyle w:val="ae"/>
+          </w:rPr>
+          <w:t>[2]</w:t>
+        </w:r>
+      </w:hyperlink>
+      <w:r>
+        <w:br/>
+      </w:r>
+      <w:r>
+        <w:br/>
+        <w:t>- Hypersomnolence, dry mouth, urinary retention</w:t>
+      </w:r>
+      <w:r>
+        <w:br/>
+      </w:r>
+      <w:r>
+        <w:lastRenderedPageBreak/>
+        <w:br/>
+        <w:t>- Anticholinergic side effects (particularly problematic in elderly)</w:t>
+      </w:r>
+      <w:r>
+        <w:br/>
+      </w:r>
+      <w:r>
+        <w:br/>
+        <w:t xml:space="preserve">- The American Geriatric Society </w:t>
+      </w:r>
+      <w:r>
+        <w:rPr>
+          <w:b/>
+          <w:bCs/>
+        </w:rPr>
+        <w:t>recommends against using meclizine in older individuals</w:t>
+      </w:r>
+      <w:r>
+        <w:t xml:space="preserve"> due to anticholinergic side effects</w:t>
+      </w:r>
+      <w:hyperlink r:id="rId162" w:history="1">
+        <w:r>
+          <w:rPr>
+            <w:rStyle w:val="ae"/>
+          </w:rPr>
+          <w:t>[1]</w:t>
+        </w:r>
+      </w:hyperlink>
+      <w:r>
+        <w:br/>
+      </w:r>
+      <w:r>
+        <w:br/>
+        <w:t>- Cognitive impairment, memory problems, falls risk</w:t>
+      </w:r>
+      <w:r>
+        <w:br/>
+      </w:r>
+      <w:r>
+        <w:br/>
+        <w:t>- For flunarizine: weight gain, drowsiness</w:t>
+      </w:r>
+      <w:hyperlink r:id="rId163" w:history="1">
+        <w:r>
+          <w:rPr>
+            <w:rStyle w:val="ae"/>
+          </w:rPr>
+          <w:t>[5]</w:t>
+        </w:r>
+      </w:hyperlink>
+      <w:hyperlink r:id="rId164" w:history="1">
+        <w:r>
+          <w:rPr>
+            <w:rStyle w:val="ae"/>
+          </w:rPr>
+          <w:t>[7]</w:t>
+        </w:r>
+      </w:hyperlink>
+      <w:r>
+        <w:br/>
+      </w:r>
+      <w:r>
+        <w:br/>
+      </w:r>
+      <w:r>
+        <w:rPr>
+          <w:b/>
+          <w:bCs/>
+        </w:rPr>
+        <w:t>Clinical Recommendations</w:t>
+      </w:r>
+      <w:r>
+        <w:br/>
+      </w:r>
+      <w:r>
+        <w:br/>
+      </w:r>
+      <w:r>
+        <w:rPr>
+          <w:b/>
+          <w:bCs/>
+        </w:rPr>
+        <w:t>Acute use only</w:t>
+      </w:r>
+      <w:r>
+        <w:t xml:space="preserve">: Vestibular suppressants may be reasonable for </w:t>
+      </w:r>
+      <w:r>
+        <w:rPr>
+          <w:b/>
+          <w:bCs/>
+        </w:rPr>
+        <w:t>very short periods (several days maximum)</w:t>
+      </w:r>
+      <w:r>
+        <w:t xml:space="preserve"> to reduce acute symptoms in conditions like vestibular neuritis or Ménière's disease attacks.</w:t>
+      </w:r>
+      <w:hyperlink r:id="rId165" w:history="1">
+        <w:r>
+          <w:rPr>
+            <w:rStyle w:val="ae"/>
+          </w:rPr>
+          <w:t>[1]</w:t>
+        </w:r>
+      </w:hyperlink>
+      <w:hyperlink r:id="rId166" w:history="1">
+        <w:r>
+          <w:rPr>
+            <w:rStyle w:val="ae"/>
+          </w:rPr>
+          <w:t>[2]</w:t>
+        </w:r>
+      </w:hyperlink>
+      <w:hyperlink r:id="rId167" w:history="1">
+        <w:r>
+          <w:rPr>
+            <w:rStyle w:val="ae"/>
+          </w:rPr>
+          <w:t>[10]</w:t>
+        </w:r>
+      </w:hyperlink>
+      <w:r>
+        <w:t xml:space="preserve"> After initial symptom control (maximum 3 days), treatment should be tailored to the underlying etiology.</w:t>
+      </w:r>
+      <w:hyperlink r:id="rId168" w:history="1">
+        <w:r>
+          <w:rPr>
+            <w:rStyle w:val="ae"/>
+          </w:rPr>
+          <w:t>[10]</w:t>
+        </w:r>
+      </w:hyperlink>
+      <w:r>
+        <w:br/>
+      </w:r>
+      <w:r>
+        <w:br/>
+      </w:r>
+      <w:r>
+        <w:rPr>
+          <w:b/>
+          <w:bCs/>
+        </w:rPr>
+        <w:t>Not for BPPV</w:t>
+      </w:r>
+      <w:r>
+        <w:t xml:space="preserve">: Guidelines strongly discourage vestibular suppressants for BPPV, which should be treated with </w:t>
+      </w:r>
+      <w:proofErr w:type="spellStart"/>
+      <w:r>
+        <w:t>canalith</w:t>
+      </w:r>
+      <w:proofErr w:type="spellEnd"/>
+      <w:r>
+        <w:t xml:space="preserve"> repositioning maneuvers (Epley maneuver).</w:t>
+      </w:r>
+      <w:hyperlink r:id="rId169" w:history="1">
+        <w:r>
+          <w:rPr>
+            <w:rStyle w:val="ae"/>
+          </w:rPr>
+          <w:t>[1]</w:t>
+        </w:r>
+      </w:hyperlink>
+      <w:hyperlink r:id="rId170" w:history="1">
+        <w:r>
+          <w:rPr>
+            <w:rStyle w:val="ae"/>
+          </w:rPr>
+          <w:t>[9]</w:t>
+        </w:r>
+      </w:hyperlink>
+      <w:r>
+        <w:br/>
+      </w:r>
+      <w:r>
+        <w:br/>
+      </w:r>
+      <w:r>
+        <w:rPr>
+          <w:b/>
+          <w:bCs/>
+        </w:rPr>
+        <w:t>Not for chronic dizziness</w:t>
+      </w:r>
+      <w:r>
+        <w:t xml:space="preserve">: For chronic dizziness conditions like PPPD, the evidence-based treatments are </w:t>
+      </w:r>
+      <w:r>
+        <w:rPr>
+          <w:b/>
+          <w:bCs/>
+        </w:rPr>
+        <w:t>vestibular rehabilitation therapy and SSRIs</w:t>
+      </w:r>
+      <w:r>
+        <w:t>, not vestibular suppressants.</w:t>
+      </w:r>
+      <w:hyperlink r:id="rId171" w:history="1">
+        <w:r>
+          <w:rPr>
+            <w:rStyle w:val="ae"/>
+          </w:rPr>
+          <w:t>[11]</w:t>
+        </w:r>
+      </w:hyperlink>
+      <w:hyperlink r:id="rId172" w:history="1">
+        <w:r>
+          <w:rPr>
+            <w:rStyle w:val="ae"/>
+          </w:rPr>
+          <w:t>[12]</w:t>
+        </w:r>
+      </w:hyperlink>
+      <w:hyperlink r:id="rId173" w:history="1">
+        <w:r>
+          <w:rPr>
+            <w:rStyle w:val="ae"/>
+          </w:rPr>
+          <w:t>[13]</w:t>
+        </w:r>
+      </w:hyperlink>
+      <w:r>
+        <w:br/>
+      </w:r>
+      <w:r>
+        <w:br/>
+      </w:r>
+      <w:r>
+        <w:rPr>
+          <w:b/>
+          <w:bCs/>
+        </w:rPr>
+        <w:t>Exception - Vestibular migraine prophylaxis</w:t>
+      </w:r>
+      <w:r>
+        <w:t xml:space="preserve">: Flunarizine (10 mg daily) may be considered specifically for </w:t>
+      </w:r>
+      <w:r>
+        <w:rPr>
+          <w:b/>
+          <w:bCs/>
+        </w:rPr>
+        <w:t>vestibular migraine prophylaxis</w:t>
+      </w:r>
+      <w:r>
+        <w:t xml:space="preserve"> when used for 2-3 months, though evidence quality is low and side effects are common.</w:t>
+      </w:r>
+      <w:hyperlink r:id="rId174" w:history="1">
+        <w:r>
+          <w:rPr>
+            <w:rStyle w:val="ae"/>
+          </w:rPr>
+          <w:t>[6]</w:t>
+        </w:r>
+      </w:hyperlink>
+      <w:hyperlink r:id="rId175" w:history="1">
+        <w:r>
+          <w:rPr>
+            <w:rStyle w:val="ae"/>
+          </w:rPr>
+          <w:t>[8]</w:t>
+        </w:r>
+      </w:hyperlink>
+      <w:hyperlink r:id="rId176" w:history="1">
+        <w:r>
+          <w:rPr>
+            <w:rStyle w:val="ae"/>
+          </w:rPr>
+          <w:t>[7]</w:t>
+        </w:r>
+      </w:hyperlink>
+      <w:r>
+        <w:t xml:space="preserve"> This is a distinct indication from general chronic dizziness.</w:t>
+      </w:r>
+      <w:r>
+        <w:br/>
+      </w:r>
+      <w:r>
+        <w:br/>
+      </w:r>
+      <w:r>
+        <w:rPr>
+          <w:b/>
+          <w:bCs/>
+        </w:rPr>
+        <w:t>Bottom Line</w:t>
+      </w:r>
+      <w:r>
+        <w:br/>
+      </w:r>
+      <w:r>
+        <w:br/>
+      </w:r>
+      <w:r>
+        <w:lastRenderedPageBreak/>
+        <w:t>Chronic use of meclizine, diphenidol, and similar vestibular suppressants provides no sustained benefit for dizziness and actively harms patients by preventing central vestibular compensation. These medications should be limited to acute symptom control for several days only. For chronic dizziness, appropriate treatments include vestibular rehabilitation, treatment of underlying conditions (e.g., SSRIs for PPPD, prophylactic medications for vestibular migraine), and physical therapy—not chronic vestibular suppressants.</w:t>
+      </w:r>
+      <w:r>
+        <w:br/>
+      </w:r>
+      <w:r>
+        <w:br/>
+        <w:t>Would you like to explore the evidence-based approach to vestibular rehabilitation therapy for patients with chronic dizziness who have been on long-term vestibular suppressants?</w:t>
+      </w:r>
+    </w:p>
+    <w:p>
+      <w:pPr>
+        <w:rPr>
+          <w:b/>
+          <w:bCs/>
+        </w:rPr>
+      </w:pPr>
+      <w:r>
+        <w:rPr>
+          <w:b/>
+          <w:bCs/>
+        </w:rPr>
+        <w:t>References</w:t>
+      </w:r>
+    </w:p>
+    <w:p>
+      <w:pPr>
+        <w:numPr>
+          <w:ilvl w:val="0"/>
+          <w:numId w:val="5"/>
+        </w:numPr>
+      </w:pPr>
+      <w:hyperlink r:id="rId177" w:history="1">
+        <w:r>
+          <w:rPr>
+            <w:rStyle w:val="ae"/>
+          </w:rPr>
+          <w:t>Guidelines for Reasonable and Appropriate Care in the Emergency Department 3 (GRACE-3): Acute Dizziness and Vertigo in the Emergency Department</w:t>
+        </w:r>
+      </w:hyperlink>
+      <w:r>
+        <w:t>. Edlow JA, Carpenter C, Akhter M, et al. Academic Emergency Medicine : Official Journal of the Society for Academic Emergency Medicine. 2023;30(5):442-486. doi:10.1111/acem.14728.</w:t>
+      </w:r>
+    </w:p>
+    <w:p>
+      <w:pPr>
+        <w:numPr>
+          <w:ilvl w:val="0"/>
+          <w:numId w:val="5"/>
+        </w:numPr>
+      </w:pPr>
+      <w:hyperlink r:id="rId178" w:history="1">
+        <w:r>
+          <w:rPr>
+            <w:rStyle w:val="ae"/>
+          </w:rPr>
+          <w:t>Clinical Practice Guideline: Ménière's Disease</w:t>
+        </w:r>
+      </w:hyperlink>
+      <w:r>
+        <w:t xml:space="preserve">. </w:t>
+      </w:r>
+      <w:proofErr w:type="spellStart"/>
+      <w:r>
+        <w:t>Basura</w:t>
+      </w:r>
+      <w:proofErr w:type="spellEnd"/>
+      <w:r>
+        <w:t xml:space="preserve"> GJ, Adams ME, Monfared A, et al. Otolaryngology--Head and Neck Surgery : Official Journal of American Academy of Otolaryngology-Head and Neck Surgery. 2020;162(2_suppl):S1-S55. doi:10.1177/0194599820909438.</w:t>
+      </w:r>
+    </w:p>
+    <w:p>
+      <w:pPr>
+        <w:numPr>
+          <w:ilvl w:val="0"/>
+          <w:numId w:val="5"/>
+        </w:numPr>
+      </w:pPr>
+      <w:hyperlink r:id="rId179" w:history="1">
+        <w:r>
+          <w:rPr>
+            <w:rStyle w:val="ae"/>
+          </w:rPr>
+          <w:t>Efficacy of Benzodiazepines or Antihistamines for Patients With Acute Vertigo: A Systematic Review and Meta-analysis</w:t>
+        </w:r>
+      </w:hyperlink>
+      <w:r>
+        <w:t>. Hunter BR, Wang AZ, Bucca AW, et al. JAMA Neurology. 2022;79(9):846-855. doi:10.1001/jamaneurol.2022.1858.</w:t>
+      </w:r>
+    </w:p>
+    <w:p>
+      <w:pPr>
+        <w:numPr>
+          <w:ilvl w:val="0"/>
+          <w:numId w:val="5"/>
+        </w:numPr>
+      </w:pPr>
+      <w:hyperlink r:id="rId180" w:history="1">
+        <w:r>
+          <w:rPr>
+            <w:rStyle w:val="ae"/>
+          </w:rPr>
+          <w:t>Comparative Study of Anti-Vertiginous and Anti-Anxious Drugs for the Treatment of Chronic Vestibular Patients With Secondary Anxiety</w:t>
+        </w:r>
+      </w:hyperlink>
+      <w:r>
+        <w:t>. Sato G, Matsuda K, Matsuoka M, et al. Acta Oto-</w:t>
+      </w:r>
+      <w:proofErr w:type="spellStart"/>
+      <w:r>
+        <w:t>Laryngologica</w:t>
+      </w:r>
+      <w:proofErr w:type="spellEnd"/>
+      <w:r>
+        <w:t>. 2019;139(7):593-597. doi:10.1080/00016489.2019.1612531.</w:t>
+      </w:r>
+    </w:p>
+    <w:p>
+      <w:pPr>
+        <w:numPr>
+          <w:ilvl w:val="0"/>
+          <w:numId w:val="5"/>
+        </w:numPr>
+      </w:pPr>
+      <w:hyperlink r:id="rId181" w:history="1">
+        <w:r>
+          <w:rPr>
+            <w:rStyle w:val="ae"/>
+          </w:rPr>
+          <w:t>Pharmacological Interventions for Prophylaxis of Vestibular Migraine</w:t>
+        </w:r>
+      </w:hyperlink>
+      <w:r>
+        <w:t xml:space="preserve">. Webster K, Dor A, Galbraith K, et al. The Cochrane Database of </w:t>
+      </w:r>
+      <w:r>
+        <w:lastRenderedPageBreak/>
+        <w:t>Systematic Reviews. 2023;2023(4):CD015187. doi:10.1002/14651858.CD015187.pub2.</w:t>
+      </w:r>
+    </w:p>
+    <w:p>
+      <w:pPr>
+        <w:numPr>
+          <w:ilvl w:val="0"/>
+          <w:numId w:val="5"/>
+        </w:numPr>
+      </w:pPr>
+      <w:hyperlink r:id="rId182" w:history="1">
+        <w:r>
+          <w:rPr>
+            <w:rStyle w:val="ae"/>
+          </w:rPr>
+          <w:t>Interventional Study of Flunarizine Therapy on Symptom Relief and Vestibular Evoked Myogenic Potential Changes in Individuals With Vestibular Migraine</w:t>
+        </w:r>
+      </w:hyperlink>
+      <w:r>
+        <w:t xml:space="preserve">. Islam FN, Kumar K, Khadilkar MN, Ebenezer A, </w:t>
+      </w:r>
+      <w:proofErr w:type="spellStart"/>
+      <w:r>
+        <w:t>Dosemane</w:t>
+      </w:r>
+      <w:proofErr w:type="spellEnd"/>
+      <w:r>
+        <w:t xml:space="preserve"> D. Audiology &amp; Neuro-Otology. 2023;28(5):338-343. doi:10.1159/000530740.</w:t>
+      </w:r>
+    </w:p>
+    <w:p>
+      <w:pPr>
+        <w:numPr>
+          <w:ilvl w:val="0"/>
+          <w:numId w:val="5"/>
+        </w:numPr>
+      </w:pPr>
+      <w:hyperlink r:id="rId183" w:history="1">
+        <w:r>
+          <w:rPr>
+            <w:rStyle w:val="ae"/>
+          </w:rPr>
+          <w:t>Flunarizine in the Prophylaxis of Migrainous Vertigo: A Randomized Controlled Trial</w:t>
+        </w:r>
+      </w:hyperlink>
+      <w:r>
+        <w:t xml:space="preserve">. Lepcha A, </w:t>
+      </w:r>
+      <w:proofErr w:type="spellStart"/>
+      <w:r>
+        <w:t>Amalanathan</w:t>
+      </w:r>
+      <w:proofErr w:type="spellEnd"/>
+      <w:r>
+        <w:t xml:space="preserve"> S, Augustine AM, Tyagi AK, Balraj A. European Archives of Oto-Rhino-Laryngology : Official Journal of the European Federation of Oto-Rhino-Laryngological Societies (EUFOS) : Affiliated With the German Society for Oto-Rhino-Laryngology - Head and Neck Surgery. 2014;271(11):2931-6. doi:10.1007/s00405-013-2786-4.</w:t>
+      </w:r>
+    </w:p>
+    <w:p>
+      <w:pPr>
+        <w:numPr>
+          <w:ilvl w:val="0"/>
+          <w:numId w:val="5"/>
+        </w:numPr>
+      </w:pPr>
+      <w:hyperlink r:id="rId184" w:history="1">
+        <w:r>
+          <w:rPr>
+            <w:rStyle w:val="ae"/>
+          </w:rPr>
+          <w:t>Prophylactic Treatments for Vestibular Migraine: A Systematic Review and Network Meta-Analysis of Randomized Clinical Trials</w:t>
+        </w:r>
+      </w:hyperlink>
+      <w:r>
+        <w:t>. Chu H, Wang Y, Ling X, Li K, Yang X. Frontiers in Pharmacology. 2023;14:1332973. doi:10.3389/fphar.2023.1332973.</w:t>
+      </w:r>
+    </w:p>
+    <w:p>
+      <w:pPr>
+        <w:numPr>
+          <w:ilvl w:val="0"/>
+          <w:numId w:val="5"/>
+        </w:numPr>
+      </w:pPr>
+      <w:hyperlink r:id="rId185" w:history="1">
+        <w:r>
+          <w:rPr>
+            <w:rStyle w:val="ae"/>
+          </w:rPr>
+          <w:t>Clinical Practice Guideline: Benign Paroxysmal Positional Vertigo (Update)</w:t>
+        </w:r>
+      </w:hyperlink>
+      <w:r>
+        <w:t>. Bhattacharyya N, Gubbels SP, Schwartz SR, et al. Otolaryngology--Head and Neck Surgery : Official Journal of American Academy of Otolaryngology-Head and Neck Surgery. 2017;156(3_suppl):S1-S47. doi:10.1177/0194599816689667.</w:t>
+      </w:r>
+    </w:p>
+    <w:p>
+      <w:pPr>
+        <w:numPr>
+          <w:ilvl w:val="0"/>
+          <w:numId w:val="5"/>
+        </w:numPr>
+      </w:pPr>
+      <w:hyperlink r:id="rId186" w:history="1">
+        <w:r>
+          <w:rPr>
+            <w:rStyle w:val="ae"/>
+          </w:rPr>
+          <w:t>Treatment of Dizziness: An Interdisciplinary Update</w:t>
+        </w:r>
+      </w:hyperlink>
+      <w:r>
+        <w:t>. Spiegel R, Rust H, Baumann T, et al. Swiss Medical Weekly. 2017;147:w14566. doi:10.4414/smw.2017.14566.</w:t>
+      </w:r>
+    </w:p>
+    <w:p>
+      <w:pPr>
+        <w:numPr>
+          <w:ilvl w:val="0"/>
+          <w:numId w:val="5"/>
+        </w:numPr>
+      </w:pPr>
+      <w:hyperlink r:id="rId187" w:history="1">
+        <w:r>
+          <w:rPr>
+            <w:rStyle w:val="ae"/>
+          </w:rPr>
+          <w:t>Effect of Conservative Therapy for Persistent Postural-Perceptual Dizziness: A Systematic Review and Meta-Analysis</w:t>
+        </w:r>
+      </w:hyperlink>
+      <w:r>
+        <w:t>. Zheng Y, Guo Z, Liu X, et al. Frontiers in Psychiatry. 2025;16:1676218. doi:10.3389/fpsyt.2025.1676218.</w:t>
+      </w:r>
+    </w:p>
+    <w:p>
+      <w:pPr>
+        <w:numPr>
+          <w:ilvl w:val="0"/>
+          <w:numId w:val="5"/>
+        </w:numPr>
+      </w:pPr>
+      <w:hyperlink r:id="rId188" w:history="1">
+        <w:r>
+          <w:rPr>
+            <w:rStyle w:val="ae"/>
+          </w:rPr>
+          <w:t xml:space="preserve">Home-Based Vestibular Rehabilitation: A Feasible and Effective Therapy </w:t>
+        </w:r>
+        <w:r>
+          <w:rPr>
+            <w:rStyle w:val="ae"/>
+          </w:rPr>
+          <w:lastRenderedPageBreak/>
+          <w:t>for Persistent Postural Perceptual Dizziness (A Pilot Study)</w:t>
+        </w:r>
+      </w:hyperlink>
+      <w:r>
+        <w:t>. Teh CS, Abdullah NA, Kamaruddin NR, et al. The Annals of Otology, Rhinology, and Laryngology. 2023;132(5):566-577. doi:10.1177/00034894221111408.</w:t>
+      </w:r>
+    </w:p>
+    <w:p>
+      <w:pPr>
+        <w:numPr>
+          <w:ilvl w:val="0"/>
+          <w:numId w:val="5"/>
+        </w:numPr>
+      </w:pPr>
+      <w:hyperlink r:id="rId189" w:history="1">
+        <w:r>
+          <w:rPr>
+            <w:rStyle w:val="ae"/>
+          </w:rPr>
+          <w:t>Effect of Vestibular Rehabilitation Therapy in Patients With Persistent Postural Perceptual Dizziness: A Systematic Review and Meta-Analysis</w:t>
+        </w:r>
+      </w:hyperlink>
+      <w:r>
+        <w:t>. Li Y, Pei X, Ding R, et al. Frontiers in Neurology. 2025;16:1599201. doi:10.3389/fneur.2025.1599201.</w:t>
+      </w:r>
+    </w:p>
+    <w:p/>
+    <w:p>
+      <w:r>
+        <w:rPr>
+          <w:b/>
+          <w:bCs/>
+        </w:rPr>
+        <w:t>Vestibular migraine</w:t>
+      </w:r>
+      <w:r>
+        <w:t xml:space="preserve"> is characterized by </w:t>
+      </w:r>
+      <w:r>
+        <w:rPr>
+          <w:b/>
+          <w:bCs/>
+        </w:rPr>
+        <w:t>recurrent attacks of vertigo or dizziness lasting 5 minutes to 72 hours</w:t>
+      </w:r>
+      <w:r>
+        <w:t>, accompanied by migraine features such as headache, photophobia, phonophobia, or visual aura.</w:t>
+      </w:r>
+      <w:hyperlink r:id="rId190" w:history="1">
+        <w:r>
+          <w:rPr>
+            <w:rStyle w:val="ae"/>
+          </w:rPr>
+          <w:t>[1]</w:t>
+        </w:r>
+      </w:hyperlink>
+      <w:hyperlink r:id="rId191" w:history="1">
+        <w:r>
+          <w:rPr>
+            <w:rStyle w:val="ae"/>
+          </w:rPr>
+          <w:t>[2]</w:t>
+        </w:r>
+      </w:hyperlink>
+      <w:r>
+        <w:t xml:space="preserve"> It is the </w:t>
+      </w:r>
+      <w:r>
+        <w:rPr>
+          <w:b/>
+          <w:bCs/>
+        </w:rPr>
+        <w:t>most common cause of recurrent spontaneous vertigo in adults</w:t>
+      </w:r>
+      <w:r>
+        <w:t xml:space="preserve"> and the </w:t>
+      </w:r>
+      <w:r>
+        <w:rPr>
+          <w:b/>
+          <w:bCs/>
+        </w:rPr>
+        <w:t>second most common cause of episodic vertigo overall</w:t>
+      </w:r>
+      <w:r>
+        <w:t xml:space="preserve"> after benign paroxysmal positional vertigo.</w:t>
+      </w:r>
+      <w:hyperlink r:id="rId192" w:history="1">
+        <w:r>
+          <w:rPr>
+            <w:rStyle w:val="ae"/>
+          </w:rPr>
+          <w:t>[3]</w:t>
+        </w:r>
+      </w:hyperlink>
+      <w:hyperlink r:id="rId193" w:history="1">
+        <w:r>
+          <w:rPr>
+            <w:rStyle w:val="ae"/>
+          </w:rPr>
+          <w:t>[1]</w:t>
+        </w:r>
+      </w:hyperlink>
+      <w:r>
+        <w:br/>
+      </w:r>
+      <w:r>
+        <w:br/>
+      </w:r>
+      <w:r>
+        <w:rPr>
+          <w:b/>
+          <w:bCs/>
+        </w:rPr>
+        <w:t>Prevalence</w:t>
+      </w:r>
+      <w:r>
+        <w:br/>
+      </w:r>
+      <w:r>
+        <w:br/>
+      </w:r>
+      <w:r>
+        <w:rPr>
+          <w:b/>
+          <w:bCs/>
+        </w:rPr>
+        <w:t>Lifetime prevalence</w:t>
+      </w:r>
+      <w:r>
+        <w:t>: 1.0% to 2.7% of the general population</w:t>
+      </w:r>
+      <w:hyperlink r:id="rId194" w:history="1">
+        <w:r>
+          <w:rPr>
+            <w:rStyle w:val="ae"/>
+          </w:rPr>
+          <w:t>[3]</w:t>
+        </w:r>
+      </w:hyperlink>
+      <w:hyperlink r:id="rId195" w:history="1">
+        <w:r>
+          <w:rPr>
+            <w:rStyle w:val="ae"/>
+          </w:rPr>
+          <w:t>[4]</w:t>
+        </w:r>
+      </w:hyperlink>
+      <w:r>
+        <w:br/>
+      </w:r>
+      <w:r>
+        <w:br/>
+      </w:r>
+      <w:r>
+        <w:rPr>
+          <w:b/>
+          <w:bCs/>
+        </w:rPr>
+        <w:t>Clinical settings</w:t>
+      </w:r>
+      <w:r>
+        <w:t>:</w:t>
+      </w:r>
+      <w:hyperlink r:id="rId196" w:history="1">
+        <w:r>
+          <w:rPr>
+            <w:rStyle w:val="ae"/>
+          </w:rPr>
+          <w:t>[3]</w:t>
+        </w:r>
+      </w:hyperlink>
+      <w:hyperlink r:id="rId197" w:history="1">
+        <w:r>
+          <w:rPr>
+            <w:rStyle w:val="ae"/>
+          </w:rPr>
+          <w:t>[4]</w:t>
+        </w:r>
+      </w:hyperlink>
+      <w:r>
+        <w:br/>
+      </w:r>
+      <w:r>
+        <w:br/>
+        <w:t xml:space="preserve">- </w:t>
+      </w:r>
+      <w:r>
+        <w:rPr>
+          <w:b/>
+          <w:bCs/>
+        </w:rPr>
+        <w:t>10% to 30%</w:t>
+      </w:r>
+      <w:r>
+        <w:t xml:space="preserve"> of patients in specialized dizziness centers have vestibular migraine as their primary diagnosis</w:t>
+      </w:r>
+      <w:r>
+        <w:br/>
+      </w:r>
+      <w:r>
+        <w:br/>
+        <w:t xml:space="preserve">- </w:t>
+      </w:r>
+      <w:r>
+        <w:rPr>
+          <w:b/>
+          <w:bCs/>
+        </w:rPr>
+        <w:t>1% to 3%</w:t>
+      </w:r>
+      <w:r>
+        <w:t xml:space="preserve"> prevalence in general population seeking care for dizziness</w:t>
+      </w:r>
+      <w:r>
+        <w:br/>
+      </w:r>
+      <w:r>
+        <w:br/>
+        <w:t xml:space="preserve">- </w:t>
+      </w:r>
+      <w:r>
+        <w:rPr>
+          <w:b/>
+          <w:bCs/>
+        </w:rPr>
+        <w:t>68.4%</w:t>
+      </w:r>
+      <w:r>
+        <w:t xml:space="preserve"> of migraine patients report vestibular symptoms, though only </w:t>
+      </w:r>
+      <w:r>
+        <w:rPr>
+          <w:b/>
+          <w:bCs/>
+        </w:rPr>
+        <w:t>15.2%</w:t>
+      </w:r>
+      <w:r>
+        <w:t xml:space="preserve"> meet full diagnostic criteria for vestibular migraine</w:t>
+      </w:r>
+      <w:hyperlink r:id="rId198" w:history="1">
+        <w:r>
+          <w:rPr>
+            <w:rStyle w:val="ae"/>
+          </w:rPr>
+          <w:t>[5]</w:t>
+        </w:r>
+      </w:hyperlink>
+      <w:r>
+        <w:br/>
+      </w:r>
+      <w:r>
+        <w:br/>
+      </w:r>
+      <w:r>
+        <w:rPr>
+          <w:b/>
+          <w:bCs/>
+        </w:rPr>
+        <w:t>Demographics</w:t>
+      </w:r>
+      <w:r>
+        <w:t>: Slight female preponderance, similar to headache migraine</w:t>
+      </w:r>
+      <w:hyperlink r:id="rId199" w:history="1">
+        <w:r>
+          <w:rPr>
+            <w:rStyle w:val="ae"/>
+          </w:rPr>
+          <w:t>[1]</w:t>
+        </w:r>
+      </w:hyperlink>
+      <w:hyperlink r:id="rId200" w:history="1">
+        <w:r>
+          <w:rPr>
+            <w:rStyle w:val="ae"/>
+          </w:rPr>
+          <w:t>[2]</w:t>
+        </w:r>
+      </w:hyperlink>
+      <w:r>
+        <w:br/>
+      </w:r>
+      <w:r>
+        <w:br/>
+      </w:r>
+      <w:r>
+        <w:rPr>
+          <w:b/>
+          <w:bCs/>
+        </w:rPr>
+        <w:lastRenderedPageBreak/>
+        <w:t>Underdiagnosis</w:t>
+      </w:r>
+      <w:r>
+        <w:t>: A significant number of cases remain undiagnosed due to unfamiliarity with the condition or diagnostic criteria.</w:t>
+      </w:r>
+      <w:hyperlink r:id="rId201" w:history="1">
+        <w:r>
+          <w:rPr>
+            <w:rStyle w:val="ae"/>
+          </w:rPr>
+          <w:t>[1]</w:t>
+        </w:r>
+      </w:hyperlink>
+      <w:hyperlink r:id="rId202" w:history="1">
+        <w:r>
+          <w:rPr>
+            <w:rStyle w:val="ae"/>
+          </w:rPr>
+          <w:t>[2]</w:t>
+        </w:r>
+      </w:hyperlink>
+      <w:r>
+        <w:br/>
+      </w:r>
+      <w:r>
+        <w:br/>
+      </w:r>
+      <w:r>
+        <w:rPr>
+          <w:b/>
+          <w:bCs/>
+        </w:rPr>
+        <w:t>Clinical Presentation</w:t>
+      </w:r>
+      <w:r>
+        <w:br/>
+      </w:r>
+      <w:r>
+        <w:br/>
+      </w:r>
+      <w:r>
+        <w:rPr>
+          <w:b/>
+          <w:bCs/>
+        </w:rPr>
+        <w:t>Vestibular symptoms</w:t>
+      </w:r>
+      <w:r>
+        <w:t xml:space="preserve"> (the predominant feature):</w:t>
+      </w:r>
+      <w:hyperlink r:id="rId203" w:history="1">
+        <w:r>
+          <w:rPr>
+            <w:rStyle w:val="ae"/>
+          </w:rPr>
+          <w:t>[1]</w:t>
+        </w:r>
+      </w:hyperlink>
+      <w:hyperlink r:id="rId204" w:history="1">
+        <w:r>
+          <w:rPr>
+            <w:rStyle w:val="ae"/>
+          </w:rPr>
+          <w:t>[6]</w:t>
+        </w:r>
+      </w:hyperlink>
+      <w:hyperlink r:id="rId205" w:history="1">
+        <w:r>
+          <w:rPr>
+            <w:rStyle w:val="ae"/>
+          </w:rPr>
+          <w:t>[2]</w:t>
+        </w:r>
+      </w:hyperlink>
+      <w:hyperlink r:id="rId206" w:history="1">
+        <w:r>
+          <w:rPr>
+            <w:rStyle w:val="ae"/>
+          </w:rPr>
+          <w:t>[3]</w:t>
+        </w:r>
+      </w:hyperlink>
+      <w:r>
+        <w:br/>
+      </w:r>
+      <w:r>
+        <w:br/>
+        <w:t xml:space="preserve">- </w:t>
+      </w:r>
+      <w:r>
+        <w:rPr>
+          <w:b/>
+          <w:bCs/>
+        </w:rPr>
+        <w:t>Spontaneous vertigo</w:t>
+      </w:r>
+      <w:r>
+        <w:t xml:space="preserve"> (spinning sensation)</w:t>
+      </w:r>
+      <w:r>
+        <w:br/>
+      </w:r>
+      <w:r>
+        <w:br/>
+        <w:t xml:space="preserve">- </w:t>
+      </w:r>
+      <w:r>
+        <w:rPr>
+          <w:b/>
+          <w:bCs/>
+        </w:rPr>
+        <w:t>Positional vertigo</w:t>
+      </w:r>
+      <w:r>
+        <w:t xml:space="preserve"> (triggered by head position changes)</w:t>
+      </w:r>
+      <w:r>
+        <w:br/>
+      </w:r>
+      <w:r>
+        <w:br/>
+        <w:t xml:space="preserve">- </w:t>
+      </w:r>
+      <w:r>
+        <w:rPr>
+          <w:b/>
+          <w:bCs/>
+        </w:rPr>
+        <w:t>Visually induced vertigo</w:t>
+      </w:r>
+      <w:r>
+        <w:t xml:space="preserve"> (triggered by complex visual stimuli or moving visual patterns)</w:t>
+      </w:r>
+      <w:r>
+        <w:br/>
+      </w:r>
+      <w:r>
+        <w:br/>
+        <w:t xml:space="preserve">- </w:t>
+      </w:r>
+      <w:r>
+        <w:rPr>
+          <w:b/>
+          <w:bCs/>
+        </w:rPr>
+        <w:t>Head motion-induced vertigo or dizziness</w:t>
+      </w:r>
+      <w:r>
+        <w:t xml:space="preserve"> with nausea</w:t>
+      </w:r>
+      <w:r>
+        <w:br/>
+      </w:r>
+      <w:r>
+        <w:br/>
+        <w:t xml:space="preserve">- </w:t>
+      </w:r>
+      <w:r>
+        <w:rPr>
+          <w:b/>
+          <w:bCs/>
+        </w:rPr>
+        <w:t>Swaying/rocking unsteadiness</w:t>
+      </w:r>
+      <w:r>
+        <w:t xml:space="preserve"> or </w:t>
+      </w:r>
+      <w:proofErr w:type="spellStart"/>
+      <w:r>
+        <w:t>nonvertiginous</w:t>
+      </w:r>
+      <w:proofErr w:type="spellEnd"/>
+      <w:r>
+        <w:t xml:space="preserve"> dizziness with nausea</w:t>
+      </w:r>
+      <w:r>
+        <w:br/>
+      </w:r>
+      <w:r>
+        <w:br/>
+        <w:t xml:space="preserve">Symptoms must be </w:t>
+      </w:r>
+      <w:r>
+        <w:rPr>
+          <w:b/>
+          <w:bCs/>
+        </w:rPr>
+        <w:t>moderate to severe intensity</w:t>
+      </w:r>
+      <w:r>
+        <w:t xml:space="preserve"> (interfering with or prohibiting daily activities) and last </w:t>
+      </w:r>
+      <w:r>
+        <w:rPr>
+          <w:b/>
+          <w:bCs/>
+        </w:rPr>
+        <w:t>5 minutes to 72 hours</w:t>
+      </w:r>
+      <w:r>
+        <w:t>.</w:t>
+      </w:r>
+      <w:hyperlink r:id="rId207" w:history="1">
+        <w:r>
+          <w:rPr>
+            <w:rStyle w:val="ae"/>
+          </w:rPr>
+          <w:t>[1]</w:t>
+        </w:r>
+      </w:hyperlink>
+      <w:hyperlink r:id="rId208" w:history="1">
+        <w:r>
+          <w:rPr>
+            <w:rStyle w:val="ae"/>
+          </w:rPr>
+          <w:t>[6]</w:t>
+        </w:r>
+      </w:hyperlink>
+      <w:hyperlink r:id="rId209" w:history="1">
+        <w:r>
+          <w:rPr>
+            <w:rStyle w:val="ae"/>
+          </w:rPr>
+          <w:t>[2]</w:t>
+        </w:r>
+      </w:hyperlink>
+      <w:r>
+        <w:br/>
+      </w:r>
+      <w:r>
+        <w:br/>
+      </w:r>
+      <w:proofErr w:type="spellStart"/>
+      <w:r>
+        <w:rPr>
+          <w:b/>
+          <w:bCs/>
+        </w:rPr>
+        <w:t>Migrainous</w:t>
+      </w:r>
+      <w:proofErr w:type="spellEnd"/>
+      <w:r>
+        <w:rPr>
+          <w:b/>
+          <w:bCs/>
+        </w:rPr>
+        <w:t xml:space="preserve"> features</w:t>
+      </w:r>
+      <w:r>
+        <w:t xml:space="preserve"> (must accompany ≥50% of vestibular episodes):</w:t>
+      </w:r>
+      <w:hyperlink r:id="rId210" w:history="1">
+        <w:r>
+          <w:rPr>
+            <w:rStyle w:val="ae"/>
+          </w:rPr>
+          <w:t>[1]</w:t>
+        </w:r>
+      </w:hyperlink>
+      <w:hyperlink r:id="rId211" w:history="1">
+        <w:r>
+          <w:rPr>
+            <w:rStyle w:val="ae"/>
+          </w:rPr>
+          <w:t>[6]</w:t>
+        </w:r>
+      </w:hyperlink>
+      <w:hyperlink r:id="rId212" w:history="1">
+        <w:r>
+          <w:rPr>
+            <w:rStyle w:val="ae"/>
+          </w:rPr>
+          <w:t>[2]</w:t>
+        </w:r>
+      </w:hyperlink>
+      <w:r>
+        <w:br/>
+      </w:r>
+      <w:r>
+        <w:br/>
+        <w:t xml:space="preserve">- </w:t>
+      </w:r>
+      <w:r>
+        <w:rPr>
+          <w:b/>
+          <w:bCs/>
+        </w:rPr>
+        <w:t>Migraine headache</w:t>
+      </w:r>
+      <w:r>
+        <w:t xml:space="preserve"> with ≥2 of the following: unilateral location, pulsating quality, moderate-to-severe intensity, aggravation by routine physical activity</w:t>
+      </w:r>
+      <w:r>
+        <w:br/>
+      </w:r>
+      <w:r>
+        <w:br/>
+        <w:t xml:space="preserve">- </w:t>
+      </w:r>
+      <w:r>
+        <w:rPr>
+          <w:b/>
+          <w:bCs/>
+        </w:rPr>
+        <w:t>Photophobia and phonophobia</w:t>
+      </w:r>
+      <w:r>
+        <w:t xml:space="preserve"> (sensitivity to light and sound)</w:t>
+      </w:r>
+      <w:r>
+        <w:br/>
+      </w:r>
+      <w:r>
+        <w:br/>
+        <w:t xml:space="preserve">- </w:t>
+      </w:r>
+      <w:r>
+        <w:rPr>
+          <w:b/>
+          <w:bCs/>
+        </w:rPr>
+        <w:t>Visual aura</w:t>
+      </w:r>
+      <w:r>
+        <w:br/>
+      </w:r>
+      <w:r>
+        <w:br/>
+        <w:t xml:space="preserve">- </w:t>
+      </w:r>
+      <w:r>
+        <w:rPr>
+          <w:b/>
+          <w:bCs/>
+        </w:rPr>
+        <w:t>Nausea and vomiting</w:t>
+      </w:r>
+      <w:hyperlink r:id="rId213" w:history="1">
+        <w:r>
+          <w:rPr>
+            <w:rStyle w:val="ae"/>
+          </w:rPr>
+          <w:t>[4]</w:t>
+        </w:r>
+      </w:hyperlink>
+      <w:r>
+        <w:br/>
+      </w:r>
+      <w:r>
+        <w:br/>
+      </w:r>
+      <w:r>
+        <w:rPr>
+          <w:b/>
+          <w:bCs/>
+        </w:rPr>
+        <w:t>Important clinical characteristics</w:t>
+      </w:r>
+      <w:r>
+        <w:t>:</w:t>
+      </w:r>
+      <w:r>
+        <w:br/>
+      </w:r>
+      <w:r>
+        <w:lastRenderedPageBreak/>
+        <w:br/>
+        <w:t xml:space="preserve">- </w:t>
+      </w:r>
+      <w:r>
+        <w:rPr>
+          <w:b/>
+          <w:bCs/>
+        </w:rPr>
+        <w:t>Headache is NOT required during every attack</w:t>
+      </w:r>
+      <w:r>
+        <w:t xml:space="preserve">—only ≥50% of episodes need </w:t>
+      </w:r>
+      <w:proofErr w:type="spellStart"/>
+      <w:r>
+        <w:t>migrainous</w:t>
+      </w:r>
+      <w:proofErr w:type="spellEnd"/>
+      <w:r>
+        <w:t xml:space="preserve"> features, which can include photophobia/phonophobia or visual aura without headache</w:t>
+      </w:r>
+      <w:hyperlink r:id="rId214" w:history="1">
+        <w:r>
+          <w:rPr>
+            <w:rStyle w:val="ae"/>
+          </w:rPr>
+          <w:t>[1]</w:t>
+        </w:r>
+      </w:hyperlink>
+      <w:hyperlink r:id="rId215" w:history="1">
+        <w:r>
+          <w:rPr>
+            <w:rStyle w:val="ae"/>
+          </w:rPr>
+          <w:t>[6]</w:t>
+        </w:r>
+      </w:hyperlink>
+      <w:hyperlink r:id="rId216" w:history="1">
+        <w:r>
+          <w:rPr>
+            <w:rStyle w:val="ae"/>
+          </w:rPr>
+          <w:t>[2]</w:t>
+        </w:r>
+      </w:hyperlink>
+      <w:r>
+        <w:br/>
+      </w:r>
+      <w:r>
+        <w:br/>
+        <w:t xml:space="preserve">- Attacks range from </w:t>
+      </w:r>
+      <w:r>
+        <w:rPr>
+          <w:b/>
+          <w:bCs/>
+        </w:rPr>
+        <w:t>minutes to hours</w:t>
+      </w:r>
+      <w:r>
+        <w:t>, with most lasting several hours</w:t>
+      </w:r>
+      <w:hyperlink r:id="rId217" w:history="1">
+        <w:r>
+          <w:rPr>
+            <w:rStyle w:val="ae"/>
+          </w:rPr>
+          <w:t>[4]</w:t>
+        </w:r>
+      </w:hyperlink>
+      <w:r>
+        <w:br/>
+      </w:r>
+      <w:r>
+        <w:br/>
+        <w:t xml:space="preserve">- Patients have </w:t>
+      </w:r>
+      <w:r>
+        <w:rPr>
+          <w:b/>
+          <w:bCs/>
+        </w:rPr>
+        <w:t>extreme sensitivity to self and surround motion</w:t>
+      </w:r>
+      <w:r>
+        <w:t xml:space="preserve"> during attacks</w:t>
+      </w:r>
+      <w:hyperlink r:id="rId218" w:history="1">
+        <w:r>
+          <w:rPr>
+            <w:rStyle w:val="ae"/>
+          </w:rPr>
+          <w:t>[4]</w:t>
+        </w:r>
+      </w:hyperlink>
+      <w:r>
+        <w:br/>
+      </w:r>
+      <w:r>
+        <w:br/>
+        <w:t xml:space="preserve">- </w:t>
+      </w:r>
+      <w:r>
+        <w:rPr>
+          <w:b/>
+          <w:bCs/>
+        </w:rPr>
+        <w:t>Interval symptoms</w:t>
+      </w:r>
+      <w:r>
+        <w:t>: Many patients experience motion sensitivity and visual dependence between attacks</w:t>
+      </w:r>
+      <w:r>
+        <w:br/>
+      </w:r>
+      <w:r>
+        <w:br/>
+      </w:r>
+      <w:r>
+        <w:rPr>
+          <w:b/>
+          <w:bCs/>
+        </w:rPr>
+        <w:t>Diagnostic Criteria (Bárány Society/International Headache Society, 2012)</w:t>
+      </w:r>
+      <w:r>
+        <w:br/>
+      </w:r>
+      <w:r>
+        <w:br/>
+      </w:r>
+      <w:r>
+        <w:rPr>
+          <w:b/>
+          <w:bCs/>
+        </w:rPr>
+        <w:t>Definite vestibular migraine</w:t>
+      </w:r>
+      <w:r>
+        <w:t xml:space="preserve"> requires ALL of the following:</w:t>
+      </w:r>
+      <w:hyperlink r:id="rId219" w:history="1">
+        <w:r>
+          <w:rPr>
+            <w:rStyle w:val="ae"/>
+          </w:rPr>
+          <w:t>[1]</w:t>
+        </w:r>
+      </w:hyperlink>
+      <w:hyperlink r:id="rId220" w:history="1">
+        <w:r>
+          <w:rPr>
+            <w:rStyle w:val="ae"/>
+          </w:rPr>
+          <w:t>[6]</w:t>
+        </w:r>
+      </w:hyperlink>
+      <w:hyperlink r:id="rId221" w:history="1">
+        <w:r>
+          <w:rPr>
+            <w:rStyle w:val="ae"/>
+          </w:rPr>
+          <w:t>[2]</w:t>
+        </w:r>
+      </w:hyperlink>
+      <w:hyperlink r:id="rId222" w:history="1">
+        <w:r>
+          <w:rPr>
+            <w:rStyle w:val="ae"/>
+          </w:rPr>
+          <w:t>[3]</w:t>
+        </w:r>
+      </w:hyperlink>
+      <w:r>
+        <w:br/>
+      </w:r>
+      <w:r>
+        <w:br/>
+        <w:t xml:space="preserve">A. </w:t>
+      </w:r>
+      <w:r>
+        <w:rPr>
+          <w:b/>
+          <w:bCs/>
+        </w:rPr>
+        <w:t>≥5 episodes</w:t>
+      </w:r>
+      <w:r>
+        <w:t xml:space="preserve"> of vestibular symptoms (moderate-to-severe intensity, lasting 5 minutes to 72 hours)</w:t>
+      </w:r>
+      <w:r>
+        <w:br/>
+      </w:r>
+      <w:r>
+        <w:br/>
+        <w:t xml:space="preserve">B. </w:t>
+      </w:r>
+      <w:r>
+        <w:rPr>
+          <w:b/>
+          <w:bCs/>
+        </w:rPr>
+        <w:t>Current or previous history of migraine</w:t>
+      </w:r>
+      <w:r>
+        <w:t xml:space="preserve"> (with or without aura per ICHD criteria)</w:t>
+      </w:r>
+      <w:r>
+        <w:br/>
+      </w:r>
+      <w:r>
+        <w:br/>
+        <w:t xml:space="preserve">C. </w:t>
+      </w:r>
+      <w:r>
+        <w:rPr>
+          <w:b/>
+          <w:bCs/>
+        </w:rPr>
+        <w:t>≥1 migraine feature during ≥50% of vestibular episodes</w:t>
+      </w:r>
+      <w:r>
+        <w:t>: migraine headache, photophobia and phonophobia, or visual aura</w:t>
+      </w:r>
+      <w:r>
+        <w:br/>
+      </w:r>
+      <w:r>
+        <w:br/>
+        <w:t xml:space="preserve">D. </w:t>
+      </w:r>
+      <w:r>
+        <w:rPr>
+          <w:b/>
+          <w:bCs/>
+        </w:rPr>
+        <w:t>Not better explained</w:t>
+      </w:r>
+      <w:r>
+        <w:t xml:space="preserve"> by another vestibular or headache disorder</w:t>
+      </w:r>
+      <w:r>
+        <w:br/>
+      </w:r>
+      <w:r>
+        <w:br/>
+      </w:r>
+      <w:r>
+        <w:rPr>
+          <w:b/>
+          <w:bCs/>
+        </w:rPr>
+        <w:t>Probable vestibular migraine</w:t>
+      </w:r>
+      <w:r>
+        <w:t>:</w:t>
+      </w:r>
+      <w:hyperlink r:id="rId223" w:history="1">
+        <w:r>
+          <w:rPr>
+            <w:rStyle w:val="ae"/>
+          </w:rPr>
+          <w:t>[1]</w:t>
+        </w:r>
+      </w:hyperlink>
+      <w:hyperlink r:id="rId224" w:history="1">
+        <w:r>
+          <w:rPr>
+            <w:rStyle w:val="ae"/>
+          </w:rPr>
+          <w:t>[6]</w:t>
+        </w:r>
+      </w:hyperlink>
+      <w:hyperlink r:id="rId225" w:history="1">
+        <w:r>
+          <w:rPr>
+            <w:rStyle w:val="ae"/>
+          </w:rPr>
+          <w:t>[2]</w:t>
+        </w:r>
+      </w:hyperlink>
+      <w:r>
+        <w:br/>
+      </w:r>
+      <w:r>
+        <w:br/>
+        <w:t>- Same vestibular symptom requirements (≥5 episodes, 5 minutes to 72 hours)</w:t>
+      </w:r>
+      <w:r>
+        <w:br/>
+      </w:r>
+      <w:r>
+        <w:br/>
+        <w:t xml:space="preserve">- Only </w:t>
+      </w:r>
+      <w:r>
+        <w:rPr>
+          <w:b/>
+          <w:bCs/>
+        </w:rPr>
+        <w:t>ONE</w:t>
+      </w:r>
+      <w:r>
+        <w:t xml:space="preserve"> of criteria B or C is fulfilled (either migraine history OR migraine </w:t>
+      </w:r>
+      <w:r>
+        <w:lastRenderedPageBreak/>
+        <w:t>features during episodes, but not both)</w:t>
+      </w:r>
+      <w:r>
+        <w:br/>
+      </w:r>
+      <w:r>
+        <w:br/>
+        <w:t>- Not better explained by another disorder</w:t>
+      </w:r>
+      <w:r>
+        <w:br/>
+      </w:r>
+      <w:r>
+        <w:br/>
+      </w:r>
+      <w:r>
+        <w:rPr>
+          <w:b/>
+          <w:bCs/>
+        </w:rPr>
+        <w:t>Functional Impact</w:t>
+      </w:r>
+      <w:r>
+        <w:br/>
+      </w:r>
+      <w:r>
+        <w:br/>
+        <w:t xml:space="preserve">Vestibular migraine causes </w:t>
+      </w:r>
+      <w:r>
+        <w:rPr>
+          <w:b/>
+          <w:bCs/>
+        </w:rPr>
+        <w:t>significant disability</w:t>
+      </w:r>
+      <w:r>
+        <w:t>:</w:t>
+      </w:r>
+      <w:hyperlink r:id="rId226" w:history="1">
+        <w:r>
+          <w:rPr>
+            <w:rStyle w:val="ae"/>
+          </w:rPr>
+          <w:t>[5]</w:t>
+        </w:r>
+      </w:hyperlink>
+      <w:r>
+        <w:br/>
+      </w:r>
+      <w:r>
+        <w:br/>
+        <w:t>- Greater headache-related disability (MIDAS scores: 40.9 ± 48.9 in vestibular migraine vs 23.6 ± 36.4 in migraine without vestibular symptoms)</w:t>
+      </w:r>
+      <w:r>
+        <w:br/>
+      </w:r>
+      <w:r>
+        <w:br/>
+        <w:t>- Poorer sleep quality (PSQI: 10.6 ± 4.0 vs 8.6 ± 3.9)</w:t>
+      </w:r>
+      <w:r>
+        <w:br/>
+      </w:r>
+      <w:r>
+        <w:br/>
+        <w:t>- More anxiety symptoms (HADS-A: 9.1 ± 4.1 vs 6.9 ± 4.3)</w:t>
+      </w:r>
+      <w:r>
+        <w:br/>
+      </w:r>
+      <w:r>
+        <w:br/>
+        <w:t>- More depression symptoms (HADS-D: 7.1 ± 4.5 vs 5.8 ± 4.2)</w:t>
+      </w:r>
+      <w:r>
+        <w:br/>
+      </w:r>
+      <w:r>
+        <w:br/>
+        <w:t xml:space="preserve">Notably, even migraine patients with vestibular symptoms who do </w:t>
+      </w:r>
+      <w:r>
+        <w:rPr>
+          <w:b/>
+          <w:bCs/>
+        </w:rPr>
+        <w:t>not</w:t>
+      </w:r>
+      <w:r>
+        <w:t xml:space="preserve"> meet full criteria for vestibular migraine still experience substantial disability compared to those without vestibular symptoms.</w:t>
+      </w:r>
+      <w:hyperlink r:id="rId227" w:history="1">
+        <w:r>
+          <w:rPr>
+            <w:rStyle w:val="ae"/>
+          </w:rPr>
+          <w:t>[5]</w:t>
+        </w:r>
+      </w:hyperlink>
+      <w:r>
+        <w:br/>
+      </w:r>
+      <w:r>
+        <w:br/>
+      </w:r>
+      <w:r>
+        <w:rPr>
+          <w:b/>
+          <w:bCs/>
+        </w:rPr>
+        <w:t>Differential Diagnosis Challenges</w:t>
+      </w:r>
+      <w:r>
+        <w:br/>
+      </w:r>
+      <w:r>
+        <w:br/>
+        <w:t>Vestibular migraine diagnosis is challenging due to symptom overlap with:</w:t>
+      </w:r>
+      <w:hyperlink r:id="rId228" w:history="1">
+        <w:r>
+          <w:rPr>
+            <w:rStyle w:val="ae"/>
+          </w:rPr>
+          <w:t>[1]</w:t>
+        </w:r>
+      </w:hyperlink>
+      <w:hyperlink r:id="rId229" w:history="1">
+        <w:r>
+          <w:rPr>
+            <w:rStyle w:val="ae"/>
+          </w:rPr>
+          <w:t>[2]</w:t>
+        </w:r>
+      </w:hyperlink>
+      <w:r>
+        <w:br/>
+      </w:r>
+      <w:r>
+        <w:br/>
+        <w:t xml:space="preserve">- </w:t>
+      </w:r>
+      <w:r>
+        <w:rPr>
+          <w:b/>
+          <w:bCs/>
+        </w:rPr>
+        <w:t>Ménière's disease</w:t>
+      </w:r>
+      <w:r>
+        <w:t xml:space="preserve"> (though vestibular migraine is much more common)</w:t>
+      </w:r>
+      <w:r>
+        <w:br/>
+      </w:r>
+      <w:r>
+        <w:br/>
+        <w:t xml:space="preserve">- </w:t>
+      </w:r>
+      <w:r>
+        <w:rPr>
+          <w:b/>
+          <w:bCs/>
+        </w:rPr>
+        <w:t>BPPV</w:t>
+      </w:r>
+      <w:r>
+        <w:t xml:space="preserve"> (positional vertigo occurs in both)</w:t>
+      </w:r>
+      <w:r>
+        <w:br/>
+      </w:r>
+      <w:r>
+        <w:br/>
+        <w:t xml:space="preserve">- </w:t>
+      </w:r>
+      <w:r>
+        <w:rPr>
+          <w:b/>
+          <w:bCs/>
+        </w:rPr>
+        <w:t>Other vestibular disorders</w:t>
+      </w:r>
+      <w:r>
+        <w:br/>
+      </w:r>
+      <w:r>
+        <w:br/>
+        <w:t xml:space="preserve">- </w:t>
+      </w:r>
+      <w:r>
+        <w:rPr>
+          <w:b/>
+          <w:bCs/>
+        </w:rPr>
+        <w:t>Headache migraine with occasional vestibular symptoms</w:t>
+      </w:r>
+      <w:r>
+        <w:t xml:space="preserve"> (which does not constitute vestibular migraine)</w:t>
+      </w:r>
+      <w:r>
+        <w:br/>
+      </w:r>
+      <w:r>
+        <w:lastRenderedPageBreak/>
+        <w:br/>
+        <w:t xml:space="preserve">The key distinguishing features are the </w:t>
+      </w:r>
+      <w:r>
+        <w:rPr>
+          <w:b/>
+          <w:bCs/>
+        </w:rPr>
+        <w:t>episodic nature</w:t>
+      </w:r>
+      <w:r>
+        <w:t xml:space="preserve"> (5 minutes to 72 hours), </w:t>
+      </w:r>
+      <w:r>
+        <w:rPr>
+          <w:b/>
+          <w:bCs/>
+        </w:rPr>
+        <w:t>recurrent pattern</w:t>
+      </w:r>
+      <w:r>
+        <w:t xml:space="preserve"> (≥5 lifetime episodes), and </w:t>
+      </w:r>
+      <w:r>
+        <w:rPr>
+          <w:b/>
+          <w:bCs/>
+        </w:rPr>
+        <w:t>temporal association with migraine features</w:t>
+      </w:r>
+      <w:r>
+        <w:t xml:space="preserve"> in ≥50% of attacks.</w:t>
+      </w:r>
+      <w:r>
+        <w:br/>
+      </w:r>
+      <w:r>
+        <w:br/>
+        <w:t>Would you like to explore the evidence-based treatment options for acute vestibular migraine attacks or prophylactic management strategies?</w:t>
+      </w:r>
+    </w:p>
+    <w:p>
+      <w:pPr>
+        <w:rPr>
+          <w:b/>
+          <w:bCs/>
+        </w:rPr>
+      </w:pPr>
+      <w:r>
+        <w:rPr>
+          <w:b/>
+          <w:bCs/>
+        </w:rPr>
+        <w:t>References</w:t>
+      </w:r>
+    </w:p>
+    <w:p>
+      <w:pPr>
+        <w:numPr>
+          <w:ilvl w:val="0"/>
+          <w:numId w:val="6"/>
+        </w:numPr>
+      </w:pPr>
+      <w:hyperlink r:id="rId230" w:history="1">
+        <w:r>
+          <w:rPr>
+            <w:rStyle w:val="ae"/>
+          </w:rPr>
+          <w:t>Non-Pharmacological Interventions for Prophylaxis of Vestibular Migraine</w:t>
+        </w:r>
+      </w:hyperlink>
+      <w:r>
+        <w:t>. Webster KE, Dor A, Galbraith K, et al. The Cochrane Database of Systematic Reviews. 2023;4:CD015321. doi:10.1002/14651858.CD015321.pub2.</w:t>
+      </w:r>
+    </w:p>
+    <w:p>
+      <w:pPr>
+        <w:numPr>
+          <w:ilvl w:val="0"/>
+          <w:numId w:val="6"/>
+        </w:numPr>
+      </w:pPr>
+      <w:hyperlink r:id="rId231" w:history="1">
+        <w:r>
+          <w:rPr>
+            <w:rStyle w:val="ae"/>
+          </w:rPr>
+          <w:t>Pharmacological Interventions for Acute Attacks of Vestibular Migraine</w:t>
+        </w:r>
+      </w:hyperlink>
+      <w:r>
+        <w:t>. Webster KE, Dor A, Galbraith K, et al. The Cochrane Database of Systematic Reviews. 2023;4:CD015322. doi:10.1002/14651858.CD015322.pub2.</w:t>
+      </w:r>
+    </w:p>
+    <w:p>
+      <w:pPr>
+        <w:numPr>
+          <w:ilvl w:val="0"/>
+          <w:numId w:val="6"/>
+        </w:numPr>
+      </w:pPr>
+      <w:hyperlink r:id="rId232" w:history="1">
+        <w:r>
+          <w:rPr>
+            <w:rStyle w:val="ae"/>
+          </w:rPr>
+          <w:t>Rizatriptan vs Placebo for Attacks of Vestibular Migraine</w:t>
+        </w:r>
+      </w:hyperlink>
+      <w:r>
+        <w:t>. Staab JP, Eggers SDZ, Jen JC, et al. JAMA Neurology. 2025;82(7):676-686. doi:10.1001/jamaneurol.2025.1006.</w:t>
+      </w:r>
+    </w:p>
+    <w:p>
+      <w:pPr>
+        <w:numPr>
+          <w:ilvl w:val="0"/>
+          <w:numId w:val="6"/>
+        </w:numPr>
+      </w:pPr>
+      <w:hyperlink r:id="rId233" w:history="1">
+        <w:r>
+          <w:rPr>
+            <w:rStyle w:val="ae"/>
+          </w:rPr>
+          <w:t>Vestibular Migraine I: Mechanisms, Diagnosis, and Clinical Features</w:t>
+        </w:r>
+      </w:hyperlink>
+      <w:r>
+        <w:t>. Baloh RW. Seminars in Neurology. 2020;40(1):76-82. doi:10.1055/s-0039-3402735.</w:t>
+      </w:r>
+    </w:p>
+    <w:p>
+      <w:pPr>
+        <w:numPr>
+          <w:ilvl w:val="0"/>
+          <w:numId w:val="6"/>
+        </w:numPr>
+      </w:pPr>
+      <w:hyperlink r:id="rId234" w:history="1">
+        <w:r>
+          <w:rPr>
+            <w:rStyle w:val="ae"/>
+          </w:rPr>
+          <w:t>Prevalence, Clinical Correlates, and Functional Implications of Vestibular Symptoms in Patients With Migraine</w:t>
+        </w:r>
+      </w:hyperlink>
+      <w:r>
+        <w:t>. Tu YH, Huang TC, Tzeng YS, et al. Neurology. 2025;105(9):e214248. doi:10.1212/WNL.0000000000214248.</w:t>
+      </w:r>
+    </w:p>
+    <w:p>
+      <w:pPr>
+        <w:numPr>
+          <w:ilvl w:val="0"/>
+          <w:numId w:val="6"/>
+        </w:numPr>
+      </w:pPr>
+      <w:hyperlink r:id="rId235" w:history="1">
+        <w:r>
+          <w:rPr>
+            <w:rStyle w:val="ae"/>
+          </w:rPr>
+          <w:t>Pharmacological Interventions for Prophylaxis of Vestibular Migraine</w:t>
+        </w:r>
+      </w:hyperlink>
+      <w:r>
+        <w:t>. Webster K, Dor A, Galbraith K, et al. The Cochrane Database of Systematic Reviews. 2023;2023(4):CD015187. doi:10.1002/14651858.CD015187.pub2.</w:t>
+      </w:r>
+    </w:p>
+    <w:p>
+      <w:pPr>
+        <w:rPr>
+          <w:rFonts w:hint="eastAsia"/>
+        </w:rPr>
+      </w:pPr>
+    </w:p>
     <w:sectPr>
       <w:pgSz w:w="11906" w:h="16838"/>
       <w:pgMar w:top="1440" w:right="1800" w:bottom="1440" w:left="1800" w:header="851" w:footer="992" w:gutter="0"/>
@@ -2881,6 +6319,119 @@
 <file path=word/numbering.xml><?xml version="1.0" encoding="utf-8"?>
 <w:numbering xmlns:wpc="http://schemas.microsoft.com/office/word/2010/wordprocessingCanvas" xmlns:cx="http://schemas.microsoft.com/office/drawing/2014/chartex" xmlns:cx1="http://schemas.microsoft.com/office/drawing/2015/9/8/chartex" xmlns:cx2="http://schemas.microsoft.com/office/drawing/2015/10/21/chartex" xmlns:cx3="http://schemas.microsoft.com/office/drawing/2016/5/9/chartex" xmlns:cx4="http://schemas.microsoft.com/office/drawing/2016/5/10/chartex" xmlns:cx5="http://schemas.microsoft.com/office/drawing/2016/5/11/chartex" xmlns:cx6="http://schemas.microsoft.com/office/drawing/2016/5/12/chartex" xmlns:cx7="http://schemas.microsoft.com/office/drawing/2016/5/13/chartex" xmlns:cx8="http://schemas.microsoft.com/office/drawing/2016/5/14/chartex" xmlns:mc="http://schemas.openxmlformats.org/markup-compatibility/2006" xmlns:aink="http://schemas.microsoft.com/office/drawing/2016/ink" xmlns:am3d="http://schemas.microsoft.com/office/drawing/2017/model3d" xmlns:o="urn:schemas-microsoft-com:office:office" xmlns:oel="http://schemas.microsoft.com/office/2019/extlst" xmlns:r="http://schemas.openxmlformats.org/officeDocument/2006/relationships" xmlns:m="http://schemas.openxmlformats.org/officeDocument/2006/math" xmlns:v="urn:schemas-microsoft-com:vml" xmlns:wp14="http://schemas.microsoft.com/office/word/2010/wordprocessingDrawing" xmlns:wp="http://schemas.openxmlformats.org/drawingml/2006/wordprocessingDrawing" xmlns:w10="urn:schemas-microsoft-com:office:word" xmlns:w="http://schemas.openxmlformats.org/wordprocessingml/2006/main" xmlns:w14="http://schemas.microsoft.com/office/word/2010/wordml" xmlns:w15="http://schemas.microsoft.com/office/word/2012/wordml" xmlns:w16cex="http://schemas.microsoft.com/office/word/2018/wordml/cex" xmlns:w16cid="http://schemas.microsoft.com/office/word/2016/wordml/cid" xmlns:w16="http://schemas.microsoft.com/office/word/2018/wordml" xmlns:w16du="http://schemas.microsoft.com/office/word/2023/wordml/word16du" xmlns:w16sdtdh="http://schemas.microsoft.com/office/word/2020/wordml/sdtdatahash" xmlns:w16sdtfl="http://schemas.microsoft.com/office/word/2024/wordml/sdtformatlock" xmlns:w16se="http://schemas.microsoft.com/office/word/2015/wordml/symex" xmlns:wpg="http://schemas.microsoft.com/office/word/2010/wordprocessingGroup" xmlns:wpi="http://schemas.microsoft.com/office/word/2010/wordprocessingInk" xmlns:wne="http://schemas.microsoft.com/office/word/2006/wordml" xmlns:wps="http://schemas.microsoft.com/office/word/2010/wordprocessingShape" mc:Ignorable="w14 w15 w16se w16cid w16 w16cex w16sdtdh w16sdtfl w16du wp14">
   <w:abstractNum w:abstractNumId="0" w15:restartNumberingAfterBreak="0">
+    <w:nsid w:val="26E974E2"/>
+    <w:multiLevelType w:val="multilevel"/>
+    <w:tmpl w:val="80E8B17E"/>
+    <w:lvl w:ilvl="0">
+      <w:start w:val="1"/>
+      <w:numFmt w:val="decimal"/>
+      <w:lvlText w:val="%1."/>
+      <w:lvlJc w:val="left"/>
+      <w:pPr>
+        <w:tabs>
+          <w:tab w:val="num" w:pos="720"/>
+        </w:tabs>
+        <w:ind w:left="720" w:hanging="360"/>
+      </w:pPr>
+    </w:lvl>
+    <w:lvl w:ilvl="1" w:tentative="1">
+      <w:start w:val="1"/>
+      <w:numFmt w:val="decimal"/>
+      <w:lvlText w:val="%2."/>
+      <w:lvlJc w:val="left"/>
+      <w:pPr>
+        <w:tabs>
+          <w:tab w:val="num" w:pos="1440"/>
+        </w:tabs>
+        <w:ind w:left="1440" w:hanging="360"/>
+      </w:pPr>
+    </w:lvl>
+    <w:lvl w:ilvl="2" w:tentative="1">
+      <w:start w:val="1"/>
+      <w:numFmt w:val="decimal"/>
+      <w:lvlText w:val="%3."/>
+      <w:lvlJc w:val="left"/>
+      <w:pPr>
+        <w:tabs>
+          <w:tab w:val="num" w:pos="2160"/>
+        </w:tabs>
+        <w:ind w:left="2160" w:hanging="360"/>
+      </w:pPr>
+    </w:lvl>
+    <w:lvl w:ilvl="3" w:tentative="1">
+      <w:start w:val="1"/>
+      <w:numFmt w:val="decimal"/>
+      <w:lvlText w:val="%4."/>
+      <w:lvlJc w:val="left"/>
+      <w:pPr>
+        <w:tabs>
+          <w:tab w:val="num" w:pos="2880"/>
+        </w:tabs>
+        <w:ind w:left="2880" w:hanging="360"/>
+      </w:pPr>
+    </w:lvl>
+    <w:lvl w:ilvl="4" w:tentative="1">
+      <w:start w:val="1"/>
+      <w:numFmt w:val="decimal"/>
+      <w:lvlText w:val="%5."/>
+      <w:lvlJc w:val="left"/>
+      <w:pPr>
+        <w:tabs>
+          <w:tab w:val="num" w:pos="3600"/>
+        </w:tabs>
+        <w:ind w:left="3600" w:hanging="360"/>
+      </w:pPr>
+    </w:lvl>
+    <w:lvl w:ilvl="5" w:tentative="1">
+      <w:start w:val="1"/>
+      <w:numFmt w:val="decimal"/>
+      <w:lvlText w:val="%6."/>
+      <w:lvlJc w:val="left"/>
+      <w:pPr>
+        <w:tabs>
+          <w:tab w:val="num" w:pos="4320"/>
+        </w:tabs>
+        <w:ind w:left="4320" w:hanging="360"/>
+      </w:pPr>
+    </w:lvl>
+    <w:lvl w:ilvl="6" w:tentative="1">
+      <w:start w:val="1"/>
+      <w:numFmt w:val="decimal"/>
+      <w:lvlText w:val="%7."/>
+      <w:lvlJc w:val="left"/>
+      <w:pPr>
+        <w:tabs>
+          <w:tab w:val="num" w:pos="5040"/>
+        </w:tabs>
+        <w:ind w:left="5040" w:hanging="360"/>
+      </w:pPr>
+    </w:lvl>
+    <w:lvl w:ilvl="7" w:tentative="1">
+      <w:start w:val="1"/>
+      <w:numFmt w:val="decimal"/>
+      <w:lvlText w:val="%8."/>
+      <w:lvlJc w:val="left"/>
+      <w:pPr>
+        <w:tabs>
+          <w:tab w:val="num" w:pos="5760"/>
+        </w:tabs>
+        <w:ind w:left="5760" w:hanging="360"/>
+      </w:pPr>
+    </w:lvl>
+    <w:lvl w:ilvl="8" w:tentative="1">
+      <w:start w:val="1"/>
+      <w:numFmt w:val="decimal"/>
+      <w:lvlText w:val="%9."/>
+      <w:lvlJc w:val="left"/>
+      <w:pPr>
+        <w:tabs>
+          <w:tab w:val="num" w:pos="6480"/>
+        </w:tabs>
+        <w:ind w:left="6480" w:hanging="360"/>
+      </w:pPr>
+    </w:lvl>
+  </w:abstractNum>
+  <w:abstractNum w:abstractNumId="1" w15:restartNumberingAfterBreak="0">
     <w:nsid w:val="3C0A1710"/>
     <w:multiLevelType w:val="multilevel"/>
     <w:tmpl w:val="0A885060"/>
@@ -2993,7 +6544,120 @@
       </w:pPr>
     </w:lvl>
   </w:abstractNum>
-  <w:abstractNum w:abstractNumId="1" w15:restartNumberingAfterBreak="0">
+  <w:abstractNum w:abstractNumId="2" w15:restartNumberingAfterBreak="0">
+    <w:nsid w:val="3E7E3055"/>
+    <w:multiLevelType w:val="multilevel"/>
+    <w:tmpl w:val="ADCC11E6"/>
+    <w:lvl w:ilvl="0">
+      <w:start w:val="1"/>
+      <w:numFmt w:val="decimal"/>
+      <w:lvlText w:val="%1."/>
+      <w:lvlJc w:val="left"/>
+      <w:pPr>
+        <w:tabs>
+          <w:tab w:val="num" w:pos="720"/>
+        </w:tabs>
+        <w:ind w:left="720" w:hanging="360"/>
+      </w:pPr>
+    </w:lvl>
+    <w:lvl w:ilvl="1" w:tentative="1">
+      <w:start w:val="1"/>
+      <w:numFmt w:val="decimal"/>
+      <w:lvlText w:val="%2."/>
+      <w:lvlJc w:val="left"/>
+      <w:pPr>
+        <w:tabs>
+          <w:tab w:val="num" w:pos="1440"/>
+        </w:tabs>
+        <w:ind w:left="1440" w:hanging="360"/>
+      </w:pPr>
+    </w:lvl>
+    <w:lvl w:ilvl="2" w:tentative="1">
+      <w:start w:val="1"/>
+      <w:numFmt w:val="decimal"/>
+      <w:lvlText w:val="%3."/>
+      <w:lvlJc w:val="left"/>
+      <w:pPr>
+        <w:tabs>
+          <w:tab w:val="num" w:pos="2160"/>
+        </w:tabs>
+        <w:ind w:left="2160" w:hanging="360"/>
+      </w:pPr>
+    </w:lvl>
+    <w:lvl w:ilvl="3" w:tentative="1">
+      <w:start w:val="1"/>
+      <w:numFmt w:val="decimal"/>
+      <w:lvlText w:val="%4."/>
+      <w:lvlJc w:val="left"/>
+      <w:pPr>
+        <w:tabs>
+          <w:tab w:val="num" w:pos="2880"/>
+        </w:tabs>
+        <w:ind w:left="2880" w:hanging="360"/>
+      </w:pPr>
+    </w:lvl>
+    <w:lvl w:ilvl="4" w:tentative="1">
+      <w:start w:val="1"/>
+      <w:numFmt w:val="decimal"/>
+      <w:lvlText w:val="%5."/>
+      <w:lvlJc w:val="left"/>
+      <w:pPr>
+        <w:tabs>
+          <w:tab w:val="num" w:pos="3600"/>
+        </w:tabs>
+        <w:ind w:left="3600" w:hanging="360"/>
+      </w:pPr>
+    </w:lvl>
+    <w:lvl w:ilvl="5" w:tentative="1">
+      <w:start w:val="1"/>
+      <w:numFmt w:val="decimal"/>
+      <w:lvlText w:val="%6."/>
+      <w:lvlJc w:val="left"/>
+      <w:pPr>
+        <w:tabs>
+          <w:tab w:val="num" w:pos="4320"/>
+        </w:tabs>
+        <w:ind w:left="4320" w:hanging="360"/>
+      </w:pPr>
+    </w:lvl>
+    <w:lvl w:ilvl="6" w:tentative="1">
+      <w:start w:val="1"/>
+      <w:numFmt w:val="decimal"/>
+      <w:lvlText w:val="%7."/>
+      <w:lvlJc w:val="left"/>
+      <w:pPr>
+        <w:tabs>
+          <w:tab w:val="num" w:pos="5040"/>
+        </w:tabs>
+        <w:ind w:left="5040" w:hanging="360"/>
+      </w:pPr>
+    </w:lvl>
+    <w:lvl w:ilvl="7" w:tentative="1">
+      <w:start w:val="1"/>
+      <w:numFmt w:val="decimal"/>
+      <w:lvlText w:val="%8."/>
+      <w:lvlJc w:val="left"/>
+      <w:pPr>
+        <w:tabs>
+          <w:tab w:val="num" w:pos="5760"/>
+        </w:tabs>
+        <w:ind w:left="5760" w:hanging="360"/>
+      </w:pPr>
+    </w:lvl>
+    <w:lvl w:ilvl="8" w:tentative="1">
+      <w:start w:val="1"/>
+      <w:numFmt w:val="decimal"/>
+      <w:lvlText w:val="%9."/>
+      <w:lvlJc w:val="left"/>
+      <w:pPr>
+        <w:tabs>
+          <w:tab w:val="num" w:pos="6480"/>
+        </w:tabs>
+        <w:ind w:left="6480" w:hanging="360"/>
+      </w:pPr>
+    </w:lvl>
+  </w:abstractNum>
+  <w:abstractNum w:abstractNumId="3" w15:restartNumberingAfterBreak="0">
     <w:nsid w:val="52E0175B"/>
     <w:multiLevelType w:val="multilevel"/>
     <w:tmpl w:val="5EAC59FE"/>
@@ -3106,7 +6770,120 @@
       </w:pPr>
     </w:lvl>
   </w:abstractNum>
-  <w:abstractNum w:abstractNumId="2" w15:restartNumberingAfterBreak="0">
+  <w:abstractNum w:abstractNumId="4" w15:restartNumberingAfterBreak="0">
+    <w:nsid w:val="5E1801B7"/>
+    <w:multiLevelType w:val="multilevel"/>
+    <w:tmpl w:val="10BA3048"/>
+    <w:lvl w:ilvl="0">
+      <w:start w:val="1"/>
+      <w:numFmt w:val="decimal"/>
+      <w:lvlText w:val="%1."/>
+      <w:lvlJc w:val="left"/>
+      <w:pPr>
+        <w:tabs>
+          <w:tab w:val="num" w:pos="720"/>
+        </w:tabs>
+        <w:ind w:left="720" w:hanging="360"/>
+      </w:pPr>
+    </w:lvl>
+    <w:lvl w:ilvl="1" w:tentative="1">
+      <w:start w:val="1"/>
+      <w:numFmt w:val="decimal"/>
+      <w:lvlText w:val="%2."/>
+      <w:lvlJc w:val="left"/>
+      <w:pPr>
+        <w:tabs>
+          <w:tab w:val="num" w:pos="1440"/>
+        </w:tabs>
+        <w:ind w:left="1440" w:hanging="360"/>
+      </w:pPr>
+    </w:lvl>
+    <w:lvl w:ilvl="2" w:tentative="1">
+      <w:start w:val="1"/>
+      <w:numFmt w:val="decimal"/>
+      <w:lvlText w:val="%3."/>
+      <w:lvlJc w:val="left"/>
+      <w:pPr>
+        <w:tabs>
+          <w:tab w:val="num" w:pos="2160"/>
+        </w:tabs>
+        <w:ind w:left="2160" w:hanging="360"/>
+      </w:pPr>
+    </w:lvl>
+    <w:lvl w:ilvl="3" w:tentative="1">
+      <w:start w:val="1"/>
+      <w:numFmt w:val="decimal"/>
+      <w:lvlText w:val="%4."/>
+      <w:lvlJc w:val="left"/>
+      <w:pPr>
+        <w:tabs>
+          <w:tab w:val="num" w:pos="2880"/>
+        </w:tabs>
+        <w:ind w:left="2880" w:hanging="360"/>
+      </w:pPr>
+    </w:lvl>
+    <w:lvl w:ilvl="4" w:tentative="1">
+      <w:start w:val="1"/>
+      <w:numFmt w:val="decimal"/>
+      <w:lvlText w:val="%5."/>
+      <w:lvlJc w:val="left"/>
+      <w:pPr>
+        <w:tabs>
+          <w:tab w:val="num" w:pos="3600"/>
+        </w:tabs>
+        <w:ind w:left="3600" w:hanging="360"/>
+      </w:pPr>
+    </w:lvl>
+    <w:lvl w:ilvl="5" w:tentative="1">
+      <w:start w:val="1"/>
+      <w:numFmt w:val="decimal"/>
+      <w:lvlText w:val="%6."/>
+      <w:lvlJc w:val="left"/>
+      <w:pPr>
+        <w:tabs>
+          <w:tab w:val="num" w:pos="4320"/>
+        </w:tabs>
+        <w:ind w:left="4320" w:hanging="360"/>
+      </w:pPr>
+    </w:lvl>
+    <w:lvl w:ilvl="6" w:tentative="1">
+      <w:start w:val="1"/>
+      <w:numFmt w:val="decimal"/>
+      <w:lvlText w:val="%7."/>
+      <w:lvlJc w:val="left"/>
+      <w:pPr>
+        <w:tabs>
+          <w:tab w:val="num" w:pos="5040"/>
+        </w:tabs>
+        <w:ind w:left="5040" w:hanging="360"/>
+      </w:pPr>
+    </w:lvl>
+    <w:lvl w:ilvl="7" w:tentative="1">
+      <w:start w:val="1"/>
+      <w:numFmt w:val="decimal"/>
+      <w:lvlText w:val="%8."/>
+      <w:lvlJc w:val="left"/>
+      <w:pPr>
+        <w:tabs>
+          <w:tab w:val="num" w:pos="5760"/>
+        </w:tabs>
+        <w:ind w:left="5760" w:hanging="360"/>
+      </w:pPr>
+    </w:lvl>
+    <w:lvl w:ilvl="8" w:tentative="1">
+      <w:start w:val="1"/>
+      <w:numFmt w:val="decimal"/>
+      <w:lvlText w:val="%9."/>
+      <w:lvlJc w:val="left"/>
+      <w:pPr>
+        <w:tabs>
+          <w:tab w:val="num" w:pos="6480"/>
+        </w:tabs>
+        <w:ind w:left="6480" w:hanging="360"/>
+      </w:pPr>
+    </w:lvl>
+  </w:abstractNum>
+  <w:abstractNum w:abstractNumId="5" w15:restartNumberingAfterBreak="0">
     <w:nsid w:val="6AB61F62"/>
     <w:multiLevelType w:val="multilevel"/>
     <w:tmpl w:val="3378FA02"/>
@@ -3220,13 +6997,22 @@
     </w:lvl>
   </w:abstractNum>
   <w:num w:numId="1" w16cid:durableId="1525703982">
-    <w:abstractNumId w:val="2"/>
+    <w:abstractNumId w:val="5"/>
   </w:num>
   <w:num w:numId="2" w16cid:durableId="10572057">
+    <w:abstractNumId w:val="3"/>
+  </w:num>
+  <w:num w:numId="3" w16cid:durableId="1995991315">
     <w:abstractNumId w:val="1"/>
   </w:num>
-  <w:num w:numId="3" w16cid:durableId="1995991315">
+  <w:num w:numId="4" w16cid:durableId="1588035552">
+    <w:abstractNumId w:val="4"/>
+  </w:num>
+  <w:num w:numId="5" w16cid:durableId="1443649740">
     <w:abstractNumId w:val="0"/>
+  </w:num>
+  <w:num w:numId="6" w16cid:durableId="49548383">
+    <w:abstractNumId w:val="2"/>
   </w:num>
 </w:numbering>
 </file>

</xml_diff>